<commit_message>
fix: harden sync recovery and server reliability
</commit_message>
<xml_diff>
--- a/docs/SyncCinema_Engineering_Journal.docx
+++ b/docs/SyncCinema_Engineering_Journal.docx
@@ -165,7 +165,7 @@
                 <w:color w:val="1E2630"/>
                 <w:sz w:val="19"/>
               </w:rPr>
-              <w:t>feature/media-load-feedback</w:t>
+              <w:t>feature/sync-correction-execution</w:t>
             </w:r>
           </w:p>
         </w:tc>
@@ -206,7 +206,7 @@
                 <w:color w:val="1E2630"/>
                 <w:sz w:val="19"/>
               </w:rPr>
-              <w:t>10a19af + 本阶段 media-load-feedback</w:t>
+              <w:t>c89e021 + 云端单机双实例实验</w:t>
             </w:r>
           </w:p>
         </w:tc>
@@ -247,7 +247,7 @@
                 <w:color w:val="1E2630"/>
                 <w:sz w:val="19"/>
               </w:rPr>
-              <w:t>libVLC 异步媒体状态与 Qt 错误反馈</w:t>
+              <w:t>自动同步校正云端验收与问题识别</w:t>
             </w:r>
           </w:p>
         </w:tc>
@@ -288,7 +288,7 @@
                 <w:color w:val="1E2630"/>
                 <w:sz w:val="19"/>
               </w:rPr>
-              <w:t>2026-09-01</w:t>
+              <w:t>2026-09-25</w:t>
             </w:r>
           </w:p>
         </w:tc>
@@ -6449,15 +6449,15 @@
           <w:color w:val="1E2630"/>
           <w:sz w:val="21"/>
         </w:rPr>
-        <w:t>测试新增 CONTROL/CORRECT/CORRECT_RESULT 协议边界、协调器完整生命周期和 MockPlayer 执行器安全门。Windows 完整构建 Qt、CLI、server 与两项测试，CTest 2/2 通过；WSL Linux server 与核心测试通过。本机双 TCP 端烟雾测试还验证了两端收到相同 CONTROL 1 PLAY，旧 epoch REPORT 被明确拒绝，持续约 1.2 秒偏差触发一次定向 CORRECT，server 最终匹配到 APPLIED 回执。本阶段尚未部署云端，因此结论是‘工程闭环与跨平台回归成立’，不能提前声称真实异地同步效果已经改善。</w:t>
+        <w:t>测试新增 CONTROL/CORRECT/CORRECT_RESULT 协议边界、协调器完整生命周期和 MockPlayer 执行器安全门。Windows 完整构建 Qt、CLI、server 与两项测试，CTest 2/2 通过；WSL Linux server 与核心测试通过。本机双 TCP 端烟雾测试还验证了两端收到相同 CONTROL 1 PLAY，旧 epoch REPORT 被明确拒绝，持续约 1.2 秒偏差触发一次定向 CORRECT，server 最终匹配到 APPLIED 回执。随后提交 c89e021 并部署到 Linux 云服务器。当前结论是‘工程闭环、跨平台回归和云端启动成立’，但双机异地校正效果仍需用真实数据验收，不能提前声称同步精度已经改善。</w:t>
       </w:r>
     </w:p>
     <w:p>
       <w:pPr>
-        <w:pStyle w:val="Heading1"/>
-      </w:pPr>
-      <w:r>
-        <w:t>8. 面试表达模板</w:t>
+        <w:pStyle w:val="Heading2"/>
+      </w:pPr>
+      <w:r>
+        <w:t>7.12 公网异常连接触发 Linux SIGPIPE</w:t>
       </w:r>
     </w:p>
     <w:p>
@@ -6470,12 +6470,81 @@
           <w:color w:val="1E2630"/>
           <w:sz w:val="21"/>
         </w:rPr>
-        <w:t>第一段可以这样说明指标演进：最初我用服务器 Room 的理论时钟评估每个客户端，但公网测试发现两端都可能因 libVLC 缓冲共同落后 Room 几百毫秒，这个指标不能直接代表观众之间不同步。于是我保留 client-to-Room 指标用于诊断，另外缓存每个 client 的最近上报，结合 RTT/2 和 server steady_clock，把异步到达的进度投影到同一时刻后计算 pair_diff。同时过滤陈旧样本和状态不一致样本，并坚持先观测后控制，为后续自动纠偏建立可信数据基础。</w:t>
+        <w:t>云端版本进入公网运行后，Qt client 报 connect failed 10061。检查发现 tmux 会话仍在，但 9000 端口已无人监听，pane 中只留下多次 client rejected: valid JOIN was not received，随后 server 无普通错误日志地回到 shell。立即执行 echo $? 得到 141，即 128 加信号 13，确认进程被 SIGPIPE 终止。这个现象没有在 Windows 和本地正常客户端回归中出现，说明部署验证覆盖了单元测试无法模拟的公网异常连接。</w:t>
       </w:r>
     </w:p>
     <w:p>
       <w:pPr>
-        <w:spacing w:before="0" w:after="120" w:line="300" w:lineRule="auto"/>
+        <w:spacing w:before="80" w:after="160" w:line="264" w:lineRule="auto"/>
+        <w:shd w:fill="F7F8FA"/>
+        <w:ind w:left="180" w:right="180"/>
+      </w:pPr>
+      <w:r>
+        <w:rPr>
+          <w:rFonts w:ascii="Consolas" w:hAnsi="Consolas" w:eastAsia="Consolas"/>
+          <w:color w:val="1E2630"/>
+          <w:sz w:val="17"/>
+        </w:rPr>
+        <w:t>public scanner connects to TCP 9000</w:t>
+        <w:br/>
+      </w:r>
+      <w:r>
+        <w:rPr>
+          <w:rFonts w:ascii="Consolas" w:hAnsi="Consolas" w:eastAsia="Consolas"/>
+          <w:color w:val="1E2630"/>
+          <w:sz w:val="17"/>
+        </w:rPr>
+        <w:t xml:space="preserve">  -&gt; sends HTTP, TLS, random bytes, or disconnects before JOIN</w:t>
+        <w:br/>
+      </w:r>
+      <w:r>
+        <w:rPr>
+          <w:rFonts w:ascii="Consolas" w:hAnsi="Consolas" w:eastAsia="Consolas"/>
+          <w:color w:val="1E2630"/>
+          <w:sz w:val="17"/>
+        </w:rPr>
+        <w:t xml:space="preserve">  -&gt; server rejects the handshake and sends REJECT</w:t>
+        <w:br/>
+      </w:r>
+      <w:r>
+        <w:rPr>
+          <w:rFonts w:ascii="Consolas" w:hAnsi="Consolas" w:eastAsia="Consolas"/>
+          <w:color w:val="1E2630"/>
+          <w:sz w:val="17"/>
+        </w:rPr>
+        <w:t xml:space="preserve">  -&gt; peer has already closed the socket</w:t>
+        <w:br/>
+      </w:r>
+      <w:r>
+        <w:rPr>
+          <w:rFonts w:ascii="Consolas" w:hAnsi="Consolas" w:eastAsia="Consolas"/>
+          <w:color w:val="1E2630"/>
+          <w:sz w:val="17"/>
+        </w:rPr>
+        <w:t xml:space="preserve">  -&gt; Linux send raises SIGPIPE</w:t>
+        <w:br/>
+      </w:r>
+      <w:r>
+        <w:rPr>
+          <w:rFonts w:ascii="Consolas" w:hAnsi="Consolas" w:eastAsia="Consolas"/>
+          <w:color w:val="1E2630"/>
+          <w:sz w:val="17"/>
+        </w:rPr>
+        <w:t xml:space="preserve">  -&gt; default signal action terminates SyncCinemaServer</w:t>
+        <w:br/>
+      </w:r>
+      <w:r>
+        <w:rPr>
+          <w:rFonts w:ascii="Consolas" w:hAnsi="Consolas" w:eastAsia="Consolas"/>
+          <w:color w:val="1E2630"/>
+          <w:sz w:val="17"/>
+        </w:rPr>
+        <w:t xml:space="preserve">  -&gt; shell exit status = 128 + 13 = 141</w:t>
+      </w:r>
+    </w:p>
+    <w:p>
+      <w:pPr>
+        <w:pStyle w:val="ListBullet"/>
       </w:pPr>
       <w:r>
         <w:rPr>
@@ -6483,12 +6552,12 @@
           <w:color w:val="1E2630"/>
           <w:sz w:val="21"/>
         </w:rPr>
-        <w:t>第二段可以这样说明稳健性：公网实测中，两台客户端暂停后只差约 2 ms，但播放时单条日志会出现约 250 ms 的量化台阶。我没有直接按单个样本 seek，而是为每次 PLAY、PAUSE、SEEK 建立独立 epoch，清理旧进度统计但保留 RTT；控制后设置 2 秒稳定期，再用最近 12 个样本的中位数评估典型偏差、P95 观察尾部风险，同时统计连续严重异常。这样未来的校正策略会基于趋势，而不是被播放器异步行为或一次网络抖动误触发。</w:t>
+        <w:t>公网端口会持续收到不遵守 SyncCinema 协议的连接；此前日志曾明确出现 visionheight.com/scan，本次代码尚未记录 peer address，因此不声称具体来源。</w:t>
       </w:r>
     </w:p>
     <w:p>
       <w:pPr>
-        <w:spacing w:before="0" w:after="120" w:line="300" w:lineRule="auto"/>
+        <w:pStyle w:val="ListBullet"/>
       </w:pPr>
       <w:r>
         <w:rPr>
@@ -6496,12 +6565,12 @@
           <w:color w:val="1E2630"/>
           <w:sz w:val="21"/>
         </w:rPr>
-        <w:t>第三段可以这样说明晚加入：自动纠偏前我先处理了一个确定性更强的问题，即新客户端加入正在播放的房间时会停在 0 秒。我让 Room 统一维护 controlEpoch，新增 SNAPSHOT 消息携带状态、毫秒位置和版本；server 用控制顺序锁把注册、取快照和发送变成一个有序步骤。client 侧实现带超时的握手，能在快照前响应心跳并保留多读字节；真实播放器等待 seekable 后按毫秒定位。同时用 Windows/Linux 核心测试、脚本双客户端和真实 libVLC 三层验证，确保协议、并发顺序和播放器行为都成立。</w:t>
+        <w:t>Windows send 通常返回 SOCKET_ERROR，而 Linux 默认可能先投递 SIGPIPE；原有 bytesSent == kSocketError 分支因此没有机会执行，这是典型的跨平台行为差异。</w:t>
       </w:r>
     </w:p>
     <w:p>
       <w:pPr>
-        <w:spacing w:before="0" w:after="120" w:line="300" w:lineRule="auto"/>
+        <w:pStyle w:val="ListBullet"/>
       </w:pPr>
       <w:r>
         <w:rPr>
@@ -6509,12 +6578,12 @@
           <w:color w:val="1E2630"/>
           <w:sz w:val="21"/>
         </w:rPr>
-        <w:t>第四段可以这样说明控制安全性：有了相对偏差后我没有直接 seek，而是把测量、决策和执行拆成三层。纯策略层按稳定期、窗口、状态、RTT、阈值、方向一致率、连续异常和冷却逐层放行，先用 read_only 建议验证 window_not_ready、persistent_skew、cooldown 的状态序列，再升级为最小执行闭环。server 用权威 CONTROL epoch 统一普通操作顺序，协调器为校正分配 command id 并匹配 ACK；client 再次验证 epoch、状态和 seek 能力后只让落后端向前追赶。这样旧命令、重复回执和 ACK 丢失都不会造成连续误跳。</w:t>
+        <w:t>临时止血是在启动 server 的 tmux shell 中执行 trap '' PIPE，使子进程继承忽略设置；send 随后返回 EPIPE，由现有错误路径处理。</w:t>
       </w:r>
     </w:p>
     <w:p>
       <w:pPr>
-        <w:spacing w:before="0" w:after="120" w:line="300" w:lineRule="auto"/>
+        <w:pStyle w:val="ListBullet"/>
       </w:pPr>
       <w:r>
         <w:rPr>
@@ -6522,12 +6591,12 @@
           <w:color w:val="1E2630"/>
           <w:sz w:val="21"/>
         </w:rPr>
-        <w:t>第五段可以这样说明客户端工程化：为了让另一台电脑由普通用户直接参与测试，我没有在 Qt 中重写一套网络代码，而是先把旧 Client.cpp 拆成纯 C++ 的 SyncClientSession。CLI 和 Qt 共用快照握手、心跳、广播与进度上报；QtClientController 在后台完成 libVLC 冷启动和连接，再用 queued invoke 回到 UI 线程。视频通过 HWND 嵌入，CMake 把 Qt 目标设为可选并自动部署 Qt/VLC runtime，因此 Linux server 构建路径保持不变。</w:t>
+        <w:t>正式修复计划是在 Linux socket 初始化层统一忽略 SIGPIPE，或对每次 send 使用 MSG_NOSIGNAL，并增加‘握手失败后对端立即断开’回归测试。</w:t>
       </w:r>
     </w:p>
     <w:p>
       <w:pPr>
-        <w:spacing w:before="0" w:after="120" w:line="300" w:lineRule="auto"/>
+        <w:pStyle w:val="ListBullet"/>
       </w:pPr>
       <w:r>
         <w:rPr>
@@ -6535,7 +6604,7 @@
           <w:color w:val="1E2630"/>
           <w:sz w:val="21"/>
         </w:rPr>
-        <w:t>第六段可以这样说明媒体一致性：Qt 实测发现切换影片会继承旧 Room 进度，我没有只在 UI 中归零，而是追到协议层补上媒体会话身份。client 先发送 JOIN，server 只有在媒体一致时才注册并返回带身份的快照；活跃房间拒绝不同媒体，最后一位用户离开后重置状态。这样从协议、Room 到 UI 都不会把一部电影的进度错误应用到另一部电影，也为后续带 epoch 的自动校正建立了正确边界。</w:t>
+        <w:t>该缺陷不只会被扫描器触发；合法客户端在 server 发送快照、心跳或控制消息时突然断网，同样可能命中，因此属于服务端可用性问题。</w:t>
       </w:r>
     </w:p>
     <w:p>
@@ -6548,20 +6617,20 @@
           <w:color w:val="1E2630"/>
           <w:sz w:val="21"/>
         </w:rPr>
-        <w:t>第七段可以这样说明异步错误治理：最初 openMedia 返回成功后，错误 URL 仍会留下黑屏，因为 libVLC 的网络和解码错误发生在内部线程。我在 PlayerController 层抽象 Opening、Buffering、Error 等事件，LibVlcPlayer 负责订阅和生命周期解绑，QtClientController 再通过 queued invoke 回到主线程。同时用 generation 隔离旧会话迟到事件，并在播放失败后离开房间，避免无效进度污染同步测量。</w:t>
+        <w:t>这次排障形成了完整证据链：客户端错误码 10061说明端口拒绝连接，ss 证明监听进程消失，tmux capture-pane 证明服务无业务错误直接退出，shell 状态 141 最终定位到 SIGPIPE。面试表达时应强调先依据证据缩小范围，再回到 POSIX socket 语义验证根因，而不是把问题笼统归因于云服务器不稳定。</w:t>
       </w:r>
     </w:p>
     <w:p>
       <w:pPr>
-        <w:pStyle w:val="Heading1"/>
-      </w:pPr>
-      <w:r>
-        <w:t>9. 后续学习重点</w:t>
+        <w:pStyle w:val="Heading2"/>
+      </w:pPr>
+      <w:r>
+        <w:t>7.13 云端单机双实例自动校正实验</w:t>
       </w:r>
     </w:p>
     <w:p>
       <w:pPr>
-        <w:pStyle w:val="ListNumber"/>
+        <w:spacing w:before="0" w:after="120" w:line="300" w:lineRule="auto"/>
       </w:pPr>
       <w:r>
         <w:rPr>
@@ -6569,12 +6638,448 @@
           <w:color w:val="1E2630"/>
           <w:sz w:val="21"/>
         </w:rPr>
-        <w:t>SyncClientSession：如何把 UI/CLI 与网络、协议、播放器并发解耦。</w:t>
+        <w:t>2026-09-25 在提交 c89e021 上完成云端 server 与同一台 Windows 电脑两个 Qt client 的完整实验。基础测试覆盖晚加入快照、双向 PLAY/PAUSE/SEEK、连续播放、房间清空后更换影片，以及异媒体加入拒绝；故障注入则通过暂停一个客户端进程 3-5 秒制造持续落后。该实验能验证公网通信、播放器停顿检测和校正闭环，但两端共享同一台电脑，不能替代真实双机在独立解码负载、系统调度和网络路径下的最终验收。</w:t>
       </w:r>
     </w:p>
+    <w:tbl>
+      <w:tblPr>
+        <w:tblW w:type="dxa" w:w="9360"/>
+        <w:jc w:val="left"/>
+        <w:tblLayout w:type="fixed"/>
+        <w:tblLook w:firstColumn="1" w:firstRow="1" w:lastColumn="0" w:lastRow="0" w:noHBand="0" w:noVBand="1" w:val="04A0"/>
+        <w:tblInd w:w="120" w:type="dxa"/>
+        <w:tblBorders>
+          <w:top w:val="single" w:sz="4" w:space="0" w:color="C8D2DE"/>
+          <w:left w:val="single" w:sz="4" w:space="0" w:color="C8D2DE"/>
+          <w:bottom w:val="single" w:sz="4" w:space="0" w:color="C8D2DE"/>
+          <w:right w:val="single" w:sz="4" w:space="0" w:color="C8D2DE"/>
+          <w:insideH w:val="single" w:sz="4" w:space="0" w:color="C8D2DE"/>
+          <w:insideV w:val="single" w:sz="4" w:space="0" w:color="C8D2DE"/>
+        </w:tblBorders>
+      </w:tblPr>
+      <w:tblGrid>
+        <w:gridCol w:w="1750"/>
+        <w:gridCol w:w="3500"/>
+        <w:gridCol w:w="4110"/>
+      </w:tblGrid>
+      <w:tr>
+        <w:trPr>
+          <w:tblHeader w:val="true"/>
+        </w:trPr>
+        <w:tc>
+          <w:tcPr>
+            <w:tcW w:type="dxa" w:w="1750"/>
+            <w:vAlign w:val="center"/>
+            <w:tcMar>
+              <w:top w:w="80" w:type="dxa"/>
+              <w:start w:w="120" w:type="dxa"/>
+              <w:bottom w:w="80" w:type="dxa"/>
+              <w:end w:w="120" w:type="dxa"/>
+            </w:tcMar>
+            <w:shd w:fill="E8EEF5"/>
+          </w:tcPr>
+          <w:p>
+            <w:pPr>
+              <w:spacing w:before="0" w:after="0" w:line="276" w:lineRule="auto"/>
+              <w:jc w:val="center"/>
+            </w:pPr>
+            <w:r>
+              <w:rPr>
+                <w:rFonts w:ascii="Microsoft YaHei" w:hAnsi="Microsoft YaHei" w:eastAsia="Microsoft YaHei"/>
+                <w:b/>
+                <w:color w:val="1F4D78"/>
+                <w:sz w:val="18"/>
+              </w:rPr>
+              <w:t>观察项</w:t>
+            </w:r>
+          </w:p>
+        </w:tc>
+        <w:tc>
+          <w:tcPr>
+            <w:tcW w:type="dxa" w:w="3500"/>
+            <w:vAlign w:val="center"/>
+            <w:tcMar>
+              <w:top w:w="80" w:type="dxa"/>
+              <w:start w:w="120" w:type="dxa"/>
+              <w:bottom w:w="80" w:type="dxa"/>
+              <w:end w:w="120" w:type="dxa"/>
+            </w:tcMar>
+            <w:shd w:fill="E8EEF5"/>
+          </w:tcPr>
+          <w:p>
+            <w:pPr>
+              <w:spacing w:before="0" w:after="0" w:line="276" w:lineRule="auto"/>
+              <w:jc w:val="center"/>
+            </w:pPr>
+            <w:r>
+              <w:rPr>
+                <w:rFonts w:ascii="Microsoft YaHei" w:hAnsi="Microsoft YaHei" w:eastAsia="Microsoft YaHei"/>
+                <w:b/>
+                <w:color w:val="1F4D78"/>
+                <w:sz w:val="18"/>
+              </w:rPr>
+              <w:t>关键数据</w:t>
+            </w:r>
+          </w:p>
+        </w:tc>
+        <w:tc>
+          <w:tcPr>
+            <w:tcW w:type="dxa" w:w="4110"/>
+            <w:vAlign w:val="center"/>
+            <w:tcMar>
+              <w:top w:w="80" w:type="dxa"/>
+              <w:start w:w="120" w:type="dxa"/>
+              <w:bottom w:w="80" w:type="dxa"/>
+              <w:end w:w="120" w:type="dxa"/>
+            </w:tcMar>
+            <w:shd w:fill="E8EEF5"/>
+          </w:tcPr>
+          <w:p>
+            <w:pPr>
+              <w:spacing w:before="0" w:after="0" w:line="276" w:lineRule="auto"/>
+              <w:jc w:val="center"/>
+            </w:pPr>
+            <w:r>
+              <w:rPr>
+                <w:rFonts w:ascii="Microsoft YaHei" w:hAnsi="Microsoft YaHei" w:eastAsia="Microsoft YaHei"/>
+                <w:b/>
+                <w:color w:val="1F4D78"/>
+                <w:sz w:val="18"/>
+              </w:rPr>
+              <w:t>数据反映的问题或结论</w:t>
+            </w:r>
+          </w:p>
+        </w:tc>
+      </w:tr>
+      <w:tr>
+        <w:trPr>
+          <w:cantSplit w:val="true"/>
+        </w:trPr>
+        <w:tc>
+          <w:tcPr>
+            <w:tcW w:type="dxa" w:w="1750"/>
+          </w:tcPr>
+          <w:p>
+            <w:pPr>
+              <w:spacing w:before="0" w:after="0" w:line="276" w:lineRule="auto"/>
+              <w:jc w:val="center"/>
+            </w:pPr>
+            <w:r>
+              <w:rPr>
+                <w:rFonts w:ascii="Microsoft YaHei" w:hAnsi="Microsoft YaHei" w:eastAsia="Microsoft YaHei"/>
+                <w:b/>
+                <w:color w:val="1E2630"/>
+                <w:sz w:val="17"/>
+              </w:rPr>
+              <w:t>会话与协议</w:t>
+            </w:r>
+          </w:p>
+        </w:tc>
+        <w:tc>
+          <w:tcPr>
+            <w:tcW w:type="dxa" w:w="3500"/>
+          </w:tcPr>
+          <w:p>
+            <w:pPr>
+              <w:spacing w:before="0" w:after="0" w:line="276" w:lineRule="auto"/>
+              <w:jc w:val="left"/>
+            </w:pPr>
+            <w:r>
+              <w:rPr>
+                <w:rFonts w:ascii="Microsoft YaHei" w:hAnsi="Microsoft YaHei" w:eastAsia="Microsoft YaHei"/>
+                <w:b w:val="0"/>
+                <w:color w:val="1E2630"/>
+                <w:sz w:val="17"/>
+              </w:rPr>
+              <w:t>7 次 JOIN/快照、30 个控制 epoch、7 次正常移除；1 次异媒体拒绝；0 个 stale_epoch</w:t>
+            </w:r>
+          </w:p>
+        </w:tc>
+        <w:tc>
+          <w:tcPr>
+            <w:tcW w:type="dxa" w:w="4110"/>
+          </w:tcPr>
+          <w:p>
+            <w:pPr>
+              <w:spacing w:before="0" w:after="0" w:line="276" w:lineRule="auto"/>
+              <w:jc w:val="left"/>
+            </w:pPr>
+            <w:r>
+              <w:rPr>
+                <w:rFonts w:ascii="Microsoft YaHei" w:hAnsi="Microsoft YaHei" w:eastAsia="Microsoft YaHei"/>
+                <w:b w:val="0"/>
+                <w:color w:val="1E2630"/>
+                <w:sz w:val="17"/>
+              </w:rPr>
+              <w:t>加入、双向控制、媒体切换、房间重置和媒体一致性检查均按设计工作。</w:t>
+            </w:r>
+          </w:p>
+        </w:tc>
+      </w:tr>
+      <w:tr>
+        <w:trPr>
+          <w:cantSplit w:val="true"/>
+        </w:trPr>
+        <w:tc>
+          <w:tcPr>
+            <w:tcW w:type="dxa" w:w="1750"/>
+          </w:tcPr>
+          <w:p>
+            <w:pPr>
+              <w:spacing w:before="0" w:after="0" w:line="276" w:lineRule="auto"/>
+              <w:jc w:val="center"/>
+            </w:pPr>
+            <w:r>
+              <w:rPr>
+                <w:rFonts w:ascii="Microsoft YaHei" w:hAnsi="Microsoft YaHei" w:eastAsia="Microsoft YaHei"/>
+                <w:b/>
+                <w:color w:val="1E2630"/>
+                <w:sz w:val="17"/>
+              </w:rPr>
+              <w:t>正常 RTT</w:t>
+            </w:r>
+          </w:p>
+        </w:tc>
+        <w:tc>
+          <w:tcPr>
+            <w:tcW w:type="dxa" w:w="3500"/>
+          </w:tcPr>
+          <w:p>
+            <w:pPr>
+              <w:spacing w:before="0" w:after="0" w:line="276" w:lineRule="auto"/>
+              <w:jc w:val="left"/>
+            </w:pPr>
+            <w:r>
+              <w:rPr>
+                <w:rFonts w:ascii="Microsoft YaHei" w:hAnsi="Microsoft YaHei" w:eastAsia="Microsoft YaHei"/>
+                <w:b w:val="0"/>
+                <w:color w:val="1E2630"/>
+                <w:sz w:val="17"/>
+              </w:rPr>
+              <w:t>各客户端中位 RTT 约 19-30 ms；正常样本 P95 约 23-38 ms</w:t>
+            </w:r>
+          </w:p>
+        </w:tc>
+        <w:tc>
+          <w:tcPr>
+            <w:tcW w:type="dxa" w:w="4110"/>
+          </w:tcPr>
+          <w:p>
+            <w:pPr>
+              <w:spacing w:before="0" w:after="0" w:line="276" w:lineRule="auto"/>
+              <w:jc w:val="left"/>
+            </w:pPr>
+            <w:r>
+              <w:rPr>
+                <w:rFonts w:ascii="Microsoft YaHei" w:hAnsi="Microsoft YaHei" w:eastAsia="Microsoft YaHei"/>
+                <w:b w:val="0"/>
+                <w:color w:val="1E2630"/>
+                <w:sz w:val="17"/>
+              </w:rPr>
+              <w:t>公网控制链路稳定，几百毫秒播放偏差的主要来源不是网络往返时延。</w:t>
+            </w:r>
+          </w:p>
+        </w:tc>
+      </w:tr>
+      <w:tr>
+        <w:trPr>
+          <w:cantSplit w:val="true"/>
+        </w:trPr>
+        <w:tc>
+          <w:tcPr>
+            <w:tcW w:type="dxa" w:w="1750"/>
+          </w:tcPr>
+          <w:p>
+            <w:pPr>
+              <w:spacing w:before="0" w:after="0" w:line="276" w:lineRule="auto"/>
+              <w:jc w:val="center"/>
+            </w:pPr>
+            <w:r>
+              <w:rPr>
+                <w:rFonts w:ascii="Microsoft YaHei" w:hAnsi="Microsoft YaHei" w:eastAsia="Microsoft YaHei"/>
+                <w:b/>
+                <w:color w:val="1E2630"/>
+                <w:sz w:val="17"/>
+              </w:rPr>
+              <w:t>晚加入偏差</w:t>
+            </w:r>
+          </w:p>
+        </w:tc>
+        <w:tc>
+          <w:tcPr>
+            <w:tcW w:type="dxa" w:w="3500"/>
+          </w:tcPr>
+          <w:p>
+            <w:pPr>
+              <w:spacing w:before="0" w:after="0" w:line="276" w:lineRule="auto"/>
+              <w:jc w:val="left"/>
+            </w:pPr>
+            <w:r>
+              <w:rPr>
+                <w:rFonts w:ascii="Microsoft YaHei" w:hAnsi="Microsoft YaHei" w:eastAsia="Microsoft YaHei"/>
+                <w:b w:val="0"/>
+                <w:color w:val="1E2630"/>
+                <w:sz w:val="17"/>
+              </w:rPr>
+              <w:t>三个晚加入阶段的稳定相对偏差约 421-537 ms；当前硬校正阈值为 750 ms</w:t>
+            </w:r>
+          </w:p>
+        </w:tc>
+        <w:tc>
+          <w:tcPr>
+            <w:tcW w:type="dxa" w:w="4110"/>
+          </w:tcPr>
+          <w:p>
+            <w:pPr>
+              <w:spacing w:before="0" w:after="0" w:line="276" w:lineRule="auto"/>
+              <w:jc w:val="left"/>
+            </w:pPr>
+            <w:r>
+              <w:rPr>
+                <w:rFonts w:ascii="Microsoft YaHei" w:hAnsi="Microsoft YaHei" w:eastAsia="Microsoft YaHei"/>
+                <w:b w:val="0"/>
+                <w:color w:val="1E2630"/>
+                <w:sz w:val="17"/>
+              </w:rPr>
+              <w:t>快照能恢复大致进度，但 libVLC 异步 seek/缓冲留下可感知的小偏差，且不会触发硬 seek。</w:t>
+            </w:r>
+          </w:p>
+        </w:tc>
+      </w:tr>
+      <w:tr>
+        <w:trPr>
+          <w:cantSplit w:val="true"/>
+        </w:trPr>
+        <w:tc>
+          <w:tcPr>
+            <w:tcW w:type="dxa" w:w="1750"/>
+          </w:tcPr>
+          <w:p>
+            <w:pPr>
+              <w:spacing w:before="0" w:after="0" w:line="276" w:lineRule="auto"/>
+              <w:jc w:val="center"/>
+            </w:pPr>
+            <w:r>
+              <w:rPr>
+                <w:rFonts w:ascii="Microsoft YaHei" w:hAnsi="Microsoft YaHei" w:eastAsia="Microsoft YaHei"/>
+                <w:b/>
+                <w:color w:val="1E2630"/>
+                <w:sz w:val="17"/>
+              </w:rPr>
+              <w:t>故障注入</w:t>
+            </w:r>
+          </w:p>
+        </w:tc>
+        <w:tc>
+          <w:tcPr>
+            <w:tcW w:type="dxa" w:w="3500"/>
+          </w:tcPr>
+          <w:p>
+            <w:pPr>
+              <w:spacing w:before="0" w:after="0" w:line="276" w:lineRule="auto"/>
+              <w:jc w:val="left"/>
+            </w:pPr>
+            <w:r>
+              <w:rPr>
+                <w:rFonts w:ascii="Microsoft YaHei" w:hAnsi="Microsoft YaHei" w:eastAsia="Microsoft YaHei"/>
+                <w:b w:val="0"/>
+                <w:color w:val="1E2630"/>
+                <w:sz w:val="17"/>
+              </w:rPr>
+              <w:t>暂停客户端进程后出现约 10.0-20.3 s 持续落后，进度上报间隔最大约 12.6-22.5 s</w:t>
+            </w:r>
+          </w:p>
+        </w:tc>
+        <w:tc>
+          <w:tcPr>
+            <w:tcW w:type="dxa" w:w="4110"/>
+          </w:tcPr>
+          <w:p>
+            <w:pPr>
+              <w:spacing w:before="0" w:after="0" w:line="276" w:lineRule="auto"/>
+              <w:jc w:val="left"/>
+            </w:pPr>
+            <w:r>
+              <w:rPr>
+                <w:rFonts w:ascii="Microsoft YaHei" w:hAnsi="Microsoft YaHei" w:eastAsia="Microsoft YaHei"/>
+                <w:b w:val="0"/>
+                <w:color w:val="1E2630"/>
+                <w:sz w:val="17"/>
+              </w:rPr>
+              <w:t>测试确实制造了客户端整体停顿；同时说明暂停期间的超大 RTT 不能解释为真实网络变差。</w:t>
+            </w:r>
+          </w:p>
+        </w:tc>
+      </w:tr>
+      <w:tr>
+        <w:trPr>
+          <w:cantSplit w:val="true"/>
+        </w:trPr>
+        <w:tc>
+          <w:tcPr>
+            <w:tcW w:type="dxa" w:w="1750"/>
+          </w:tcPr>
+          <w:p>
+            <w:pPr>
+              <w:spacing w:before="0" w:after="0" w:line="276" w:lineRule="auto"/>
+              <w:jc w:val="center"/>
+            </w:pPr>
+            <w:r>
+              <w:rPr>
+                <w:rFonts w:ascii="Microsoft YaHei" w:hAnsi="Microsoft YaHei" w:eastAsia="Microsoft YaHei"/>
+                <w:b/>
+                <w:color w:val="1E2630"/>
+                <w:sz w:val="17"/>
+              </w:rPr>
+              <w:t>自动校正</w:t>
+            </w:r>
+          </w:p>
+        </w:tc>
+        <w:tc>
+          <w:tcPr>
+            <w:tcW w:type="dxa" w:w="3500"/>
+          </w:tcPr>
+          <w:p>
+            <w:pPr>
+              <w:spacing w:before="0" w:after="0" w:line="276" w:lineRule="auto"/>
+              <w:jc w:val="left"/>
+            </w:pPr>
+            <w:r>
+              <w:rPr>
+                <w:rFonts w:ascii="Microsoft YaHei" w:hAnsi="Microsoft YaHei" w:eastAsia="Microsoft YaHei"/>
+                <w:b w:val="0"/>
+                <w:color w:val="1E2630"/>
+                <w:sz w:val="17"/>
+              </w:rPr>
+              <w:t>3 次 CORRECT 均返回 APPLIED；触发偏差中位数为 20328/10497/10000 ms，校正后约 126/108/20 ms；ACK 为 30/29/34 ms</w:t>
+            </w:r>
+          </w:p>
+        </w:tc>
+        <w:tc>
+          <w:tcPr>
+            <w:tcW w:type="dxa" w:w="4110"/>
+          </w:tcPr>
+          <w:p>
+            <w:pPr>
+              <w:spacing w:before="0" w:after="0" w:line="276" w:lineRule="auto"/>
+              <w:jc w:val="left"/>
+            </w:pPr>
+            <w:r>
+              <w:rPr>
+                <w:rFonts w:ascii="Microsoft YaHei" w:hAnsi="Microsoft YaHei" w:eastAsia="Microsoft YaHei"/>
+                <w:b w:val="0"/>
+                <w:color w:val="1E2630"/>
+                <w:sz w:val="17"/>
+              </w:rPr>
+              <w:t>目标端选择、命令派发、客户端执行和回执匹配完整闭环，且校正后迅速恢复到亚秒级。</w:t>
+            </w:r>
+          </w:p>
+        </w:tc>
+      </w:tr>
+    </w:tbl>
     <w:p>
       <w:pPr>
-        <w:pStyle w:val="ListNumber"/>
+        <w:pStyle w:val="ListBullet"/>
       </w:pPr>
       <w:r>
         <w:rPr>
@@ -6582,12 +7087,12 @@
           <w:color w:val="1E2630"/>
           <w:sz w:val="21"/>
         </w:rPr>
-        <w:t>QtClientController：为什么慢操作放到 worker thread，QWidget 更新必须回到 UI 线程。</w:t>
+        <w:t>晚加入后的轻微延迟与日志一致：稳定相对偏差约 421-537 ms，低于 750 ms 硬 seek 阈值；执行一次新的播放控制后偏差明显缩小，说明权威 CONTROL 能重新对齐两端，而初始快照应用仍存在播放器异步稳定窗口。</w:t>
       </w:r>
     </w:p>
     <w:p>
       <w:pPr>
-        <w:pStyle w:val="ListNumber"/>
+        <w:pStyle w:val="ListBullet"/>
       </w:pPr>
       <w:r>
         <w:rPr>
@@ -6595,12 +7100,12 @@
           <w:color w:val="1E2630"/>
           <w:sz w:val="21"/>
         </w:rPr>
-        <w:t>QObject signal、QMetaObject::invokeMethod 与 QueuedConnection 的线程边界。</w:t>
+        <w:t>一次晚加入期间出现 Playing 状态却短暂上报 0 ms，形成约 55 s 离群值，随后自行恢复。现有稳定窗口和方向安全门阻止了误校正，但后续应让新客户端在实际位置稳定前暂不参与校正统计。</w:t>
       </w:r>
     </w:p>
     <w:p>
       <w:pPr>
-        <w:pStyle w:val="ListNumber"/>
+        <w:pStyle w:val="ListBullet"/>
       </w:pPr>
       <w:r>
         <w:rPr>
@@ -6608,12 +7113,12 @@
           <w:color w:val="1E2630"/>
           <w:sz w:val="21"/>
         </w:rPr>
-        <w:t>libvlc_media_player_set_hwnd：第三方播放器如何嵌入 Qt 原生窗口。</w:t>
+        <w:t>暂停进程期间 RTT 最大值达到约 10.9 s 和 20.8 s，这是 PONG 线程随进程一起停顿造成的测量结果，不代表公网链路本身恶化；正常 RTT 中位数仍为 19-30 ms。后续统计应优先使用滚动中位数或低分位数，避免累计平均值被故障注入污染。</w:t>
       </w:r>
     </w:p>
     <w:p>
       <w:pPr>
-        <w:pStyle w:val="ListNumber"/>
+        <w:pStyle w:val="ListBullet"/>
       </w:pPr>
       <w:r>
         <w:rPr>
@@ -6621,12 +7126,12 @@
           <w:color w:val="1E2630"/>
           <w:sz w:val="21"/>
         </w:rPr>
-        <w:t>libvlc_event_attach/detach：异步第三方回调的订阅、线程边界和对象生命周期。</w:t>
+        <w:t>房间清空后 Room 快照已回到 epoch 0，但 metrics 日志曾短暂保留旧 epoch 3，说明业务状态重置正确而统计收集器未同步重置。当前不影响协议校验和校正执行，但会污染分析结论，应补充 metrics 会话重置接口与回归测试。</w:t>
       </w:r>
     </w:p>
     <w:p>
       <w:pPr>
-        <w:pStyle w:val="ListNumber"/>
+        <w:spacing w:before="0" w:after="120" w:line="300" w:lineRule="auto"/>
       </w:pPr>
       <w:r>
         <w:rPr>
@@ -6634,12 +7139,20 @@
           <w:color w:val="1E2630"/>
           <w:sz w:val="21"/>
         </w:rPr>
-        <w:t>PlayerEvent 抽象：为什么底层事件要先翻译成领域类型，再交给 Qt 展示。</w:t>
+        <w:t>阶段结论：自动校正已经从‘代码可执行’推进到‘云端故障注入下有量化效果’。三次校正均选中真实落后端，命令全部成功回执，校正后典型偏差降至 20-126 ms，证明最小闭环有效。当前主要问题已从‘能否校正’转为晚加入中等偏差、播放器位置稳定性、统计会话重置和 Linux SIGPIPE 等可靠性收口；在这些问题修复前，不把本次结果表述为真实双机异地同步精度的最终结论。</w:t>
       </w:r>
     </w:p>
     <w:p>
       <w:pPr>
-        <w:pStyle w:val="ListNumber"/>
+        <w:pStyle w:val="Heading2"/>
+      </w:pPr>
+      <w:r>
+        <w:t>7.14 可靠性修复与提交前云端复验</w:t>
+      </w:r>
+    </w:p>
+    <w:p>
+      <w:pPr>
+        <w:spacing w:before="0" w:after="120" w:line="300" w:lineRule="auto"/>
       </w:pPr>
       <w:r>
         <w:rPr>
@@ -6647,12 +7160,12 @@
           <w:color w:val="1E2630"/>
           <w:sz w:val="21"/>
         </w:rPr>
-        <w:t>lifecycleGeneration：如何阻止旧播放器排队中的回调影响一次新的连接。</w:t>
+        <w:t>2026-10-20 针对 7.12 和 7.13 暴露的问题完成一轮可靠性收口，并在提交前将候选 Linux server 单独部署到云端。代码没有覆盖旧发布目录，便于异常时快速回退；Windows 完整构建与两项 CTest、WSL Linux server 构建与核心测试均通过后，才进入真实播放器复验。</w:t>
       </w:r>
     </w:p>
     <w:p>
       <w:pPr>
-        <w:pStyle w:val="ListNumber"/>
+        <w:pStyle w:val="ListBullet"/>
       </w:pPr>
       <w:r>
         <w:rPr>
@@ -6660,12 +7173,12 @@
           <w:color w:val="1E2630"/>
           <w:sz w:val="21"/>
         </w:rPr>
-        <w:t>CMake 的可选目标、find_package、AUTOMOC 和 POST_BUILD runtime 部署。</w:t>
+        <w:t>晚加入位置确认：libVLC seek 是异步命令，调用成功不代表画面已到达目标。client 新增位置收敛跟踪器，Playing 状态按经过时间推进期望位置，要求连续两个样本落在 250 ms 容差内；必要时最多补发两次追赶 seek，确认后才启动进度上报，避免 Playing/0 ms 等未应用快照样本进入校正窗口。</w:t>
       </w:r>
     </w:p>
     <w:p>
       <w:pPr>
-        <w:pStyle w:val="ListNumber"/>
+        <w:pStyle w:val="ListBullet"/>
       </w:pPr>
       <w:r>
         <w:rPr>
@@ -6673,12 +7186,12 @@
           <w:color w:val="1E2630"/>
           <w:sz w:val="21"/>
         </w:rPr>
-        <w:t>evaluateSyncCorrection：如何用提前返回把安全门写成可读、可测试的纯决策函数。</w:t>
+        <w:t>RTT 稳健估计：每个 client 保存最近 60 个微秒级 RTT，以窗口 P10 作为当前低排队基线，同时记录滚动平均值、中位数、P95 和 lifetime min/max。进程暂停产生的秒级 PONG 延迟仍能被 P95 观察，但不会长期抬高 one_way 补偿。</w:t>
       </w:r>
     </w:p>
     <w:p>
       <w:pPr>
-        <w:pStyle w:val="ListNumber"/>
+        <w:pStyle w:val="ListBullet"/>
       </w:pPr>
       <w:r>
         <w:rPr>
@@ -6686,12 +7199,12 @@
           <w:color w:val="1E2630"/>
           <w:sz w:val="21"/>
         </w:rPr>
-        <w:t>calculateDirectionAgreementPercent：为什么偏差大小之外还必须验证方向稳定。</w:t>
+        <w:t>会话生命周期：Room::removeClient 返回房间是否已经清空；最后一个 client 离开时，server 同步调用 metrics.resetSession，清除旧 epoch、client RTT、pair 窗口和校正冷却。复验日志出现 metrics_session_reset previous_epoch=18，证明业务会话与统计会话一起结束。</w:t>
       </w:r>
     </w:p>
     <w:p>
       <w:pPr>
-        <w:pStyle w:val="ListNumber"/>
+        <w:pStyle w:val="ListBullet"/>
       </w:pPr>
       <w:r>
         <w:rPr>
@@ -6699,12 +7212,12 @@
           <w:color w:val="1E2630"/>
           <w:sz w:val="21"/>
         </w:rPr>
-        <w:t>PairWindowStats 的建议去重与模拟冷却：状态为什么属于 pair+epoch，而不是某个 client。</w:t>
+        <w:t>Linux SIGPIPE：server 发送统一走 sendSocket，POSIX 分支使用 MSG_NOSIGNAL。云端向 9000 端口连续制造 20 次 connect 后 TCP RST，日志得到 EPIPE 32，但原 PID 与监听端口保持不变；异常 peer 现在只会损失 单条连接，不再终止整个进程。</w:t>
       </w:r>
     </w:p>
     <w:p>
       <w:pPr>
-        <w:pStyle w:val="ListNumber"/>
+        <w:spacing w:before="0" w:after="120" w:line="300" w:lineRule="auto"/>
       </w:pPr>
       <w:r>
         <w:rPr>
@@ -6712,12 +7225,12 @@
           <w:color w:val="1E2630"/>
           <w:sz w:val="21"/>
         </w:rPr>
-        <w:t>策略单元测试：如何用输入夹具覆盖安全门和正负方向，而不启动网络与播放器。</w:t>
+        <w:t>真实单机双实例复验中，第二个 client 在房间约 38082 ms 时加入；最初两条 pair 样本偏差约 1091 ms，随后约 1-2 秒内降到 36-287 ms，没有触发错误校正，用户也未观察到可见问题。故障注入形成两次独立停顿：client 2 的 REPORT 间隔约 24825 ms、窗口中位偏差约 22128 ms，client 1 的 REPORT 间隔约 10457 ms、窗口中位偏差约 8053 ms。server 两次都选择真实落后端，APPLIED 回执延迟分别为 28 ms 和 23 ms；恢复后 Playing 窗口最终达到 median 约 88 ms、P95 约 90 ms。</w:t>
       </w:r>
     </w:p>
     <w:p>
       <w:pPr>
-        <w:pStyle w:val="ListNumber"/>
+        <w:spacing w:before="0" w:after="120" w:line="300" w:lineRule="auto"/>
       </w:pPr>
       <w:r>
         <w:rPr>
@@ -6725,12 +7238,20 @@
           <w:color w:val="1E2630"/>
           <w:sz w:val="21"/>
         </w:rPr>
-        <w:t>SyncServer 的 accept 初始化临界区：为什么 addClient、getSnapshot、send 必须与控制命令共用顺序锁。</w:t>
+        <w:t>本次复验同时验证了新 RTT 解释：两端稳定基线分别约为 22 ms 和 28 ms；暂停期间 lifetime max 达到约 8.8 s 和 23.5 s，滚动 P95 显示异常，但 baseline 始终保持稳定。结论是本轮已解决已知可靠性阻塞项，最小自动校正闭环具备提交条件；仍需保留‘同机双实例’限定，不能把结果表述为真实异地双机最终精度。</w:t>
       </w:r>
     </w:p>
     <w:p>
       <w:pPr>
-        <w:pStyle w:val="ListNumber"/>
+        <w:pStyle w:val="Heading1"/>
+      </w:pPr>
+      <w:r>
+        <w:t>8. 面试表达模板</w:t>
+      </w:r>
+    </w:p>
+    <w:p>
+      <w:pPr>
+        <w:spacing w:before="0" w:after="120" w:line="300" w:lineRule="auto"/>
       </w:pPr>
       <w:r>
         <w:rPr>
@@ -6738,12 +7259,12 @@
           <w:color w:val="1E2630"/>
           <w:sz w:val="21"/>
         </w:rPr>
-        <w:t>SyncClientSession::receiveInitialSnapshot：select 超时、PING 兼容和 TCP 多读缓冲如何组成握手状态机。</w:t>
+        <w:t>第一段可以这样说明指标演进：最初我用服务器 Room 的理论时钟评估每个客户端，但公网测试发现两端都可能因 libVLC 缓冲共同落后 Room 几百毫秒，这个指标不能直接代表观众之间不同步。于是我保留 client-to-Room 指标用于诊断，另外缓存每个 client 的最近上报，结合 RTT/2 和 server steady_clock，把异步到达的进度投影到同一时刻后计算 pair_diff。同时过滤陈旧样本和状态不一致样本，并坚持先观测后控制，为后续自动纠偏建立可信数据基础。</w:t>
       </w:r>
     </w:p>
     <w:p>
       <w:pPr>
-        <w:pStyle w:val="ListNumber"/>
+        <w:spacing w:before="0" w:after="120" w:line="300" w:lineRule="auto"/>
       </w:pPr>
       <w:r>
         <w:rPr>
@@ -6751,12 +7272,12 @@
           <w:color w:val="1E2630"/>
           <w:sz w:val="21"/>
         </w:rPr>
-        <w:t>SyncClientSession::applyInitialSnapshot：播放器准备、毫秒 seek 和 Playing 状态经过时间补偿。</w:t>
+        <w:t>第二段可以这样说明稳健性：公网实测中，两台客户端暂停后只差约 2 ms，但播放时单条日志会出现约 250 ms 的量化台阶。我没有直接按单个样本 seek，而是为每次 PLAY、PAUSE、SEEK 建立独立 epoch，清理旧进度统计但保留 RTT；控制后设置 2 秒稳定期，再用最近 12 个样本的中位数评估典型偏差、P95 观察尾部风险，同时统计连续严重异常。这样未来的校正策略会基于趋势，而不是被播放器异步行为或一次网络抖动误触发。</w:t>
       </w:r>
     </w:p>
     <w:p>
       <w:pPr>
-        <w:pStyle w:val="ListNumber"/>
+        <w:spacing w:before="0" w:after="120" w:line="300" w:lineRule="auto"/>
       </w:pPr>
       <w:r>
         <w:rPr>
@@ -6764,12 +7285,12 @@
           <w:color w:val="1E2630"/>
           <w:sz w:val="21"/>
         </w:rPr>
-        <w:t>Room::getSnapshot：如何在同一把锁下形成 state+epoch 的一致快照。</w:t>
+        <w:t>第三段可以这样说明晚加入：自动纠偏前我先处理了一个确定性更强的问题，即新客户端加入正在播放的房间时会停在 0 秒。我让 Room 统一维护 controlEpoch，新增 SNAPSHOT 消息携带状态、毫秒位置和版本；server 用控制顺序锁把注册、取快照和发送变成一个有序步骤。client 侧实现带超时的握手，能在快照前响应心跳并保留多读字节；真实播放器等待 seekable 后按毫秒定位。同时用 Windows/Linux 核心测试、脚本双客户端和真实 libVLC 三层验证，确保协议、并发顺序和播放器行为都成立。</w:t>
       </w:r>
     </w:p>
     <w:p>
       <w:pPr>
-        <w:pStyle w:val="ListNumber"/>
+        <w:spacing w:before="0" w:after="120" w:line="300" w:lineRule="auto"/>
       </w:pPr>
       <w:r>
         <w:rPr>
@@ -6777,12 +7298,12 @@
           <w:color w:val="1E2630"/>
           <w:sz w:val="21"/>
         </w:rPr>
-        <w:t>SyncMetricsCollector::recordProgressReport：共享状态、快照、时间投影和日志输出如何分层。</w:t>
+        <w:t>第四段可以这样说明控制安全性：有了相对偏差后我没有直接 seek，而是把测量、决策和执行拆成三层。纯策略层按稳定期、窗口、状态、RTT、阈值、方向一致率、连续异常和冷却逐层放行，先用 read_only 建议验证 window_not_ready、persistent_skew、cooldown 的状态序列，再升级为最小执行闭环。server 用权威 CONTROL epoch 统一普通操作顺序，协调器为校正分配 command id 并匹配 ACK；client 再次验证 epoch、状态和 seek 能力后只让落后端向前追赶。这样旧命令、重复回执和 ACK 丢失都不会造成连续误跳。</w:t>
       </w:r>
     </w:p>
     <w:p>
       <w:pPr>
-        <w:pStyle w:val="ListNumber"/>
+        <w:spacing w:before="0" w:after="120" w:line="300" w:lineRule="auto"/>
       </w:pPr>
       <w:r>
         <w:rPr>
@@ -6790,12 +7311,12 @@
           <w:color w:val="1E2630"/>
           <w:sz w:val="21"/>
         </w:rPr>
-        <w:t>projectPositionToServerTime：为什么 Playing 才能按经过时间推进。</w:t>
+        <w:t>第五段可以这样说明客户端工程化：为了让另一台电脑由普通用户直接参与测试，我没有在 Qt 中重写一套网络代码，而是先把旧 Client.cpp 拆成纯 C++ 的 SyncClientSession。CLI 和 Qt 共用快照握手、心跳、广播与进度上报；QtClientController 在后台完成 libVLC 冷启动和连接，再用 queued invoke 回到 UI 线程。视频通过 HWND 嵌入，CMake 把 Qt 目标设为可选并自动部署 Qt/VLC runtime，因此 Linux server 构建路径保持不变。</w:t>
       </w:r>
     </w:p>
     <w:p>
       <w:pPr>
-        <w:pStyle w:val="ListNumber"/>
+        <w:spacing w:before="0" w:after="120" w:line="300" w:lineRule="auto"/>
       </w:pPr>
       <w:r>
         <w:rPr>
@@ -6803,12 +7324,12 @@
           <w:color w:val="1E2630"/>
           <w:sz w:val="21"/>
         </w:rPr>
-        <w:t>SyncMetricsCollector::beginControlEpoch：为什么 RTT 保留，而播放偏差必须按控制周期重置。</w:t>
+        <w:t>第六段可以这样说明媒体一致性：Qt 实测发现切换影片会继承旧 Room 进度，我没有只在 UI 中归零，而是追到协议层补上媒体会话身份。client 先发送 JOIN，server 只有在媒体一致时才注册并返回带身份的快照；活跃房间拒绝不同媒体，最后一位用户离开后重置状态。这样从协议、Room 到 UI 都不会把一部电影的进度错误应用到另一部电影，也为后续带 epoch 的自动校正建立了正确边界。</w:t>
       </w:r>
     </w:p>
     <w:p>
       <w:pPr>
-        <w:pStyle w:val="ListNumber"/>
+        <w:spacing w:before="0" w:after="120" w:line="300" w:lineRule="auto"/>
       </w:pPr>
       <w:r>
         <w:rPr>
@@ -6816,12 +7337,12 @@
           <w:color w:val="1E2630"/>
           <w:sz w:val="21"/>
         </w:rPr>
-        <w:t>medianOf / percentile95OfAbsoluteDiffs：稳健统计如何减少离群样本误导。</w:t>
+        <w:t>第七段可以这样说明异步错误治理：最初 openMedia 返回成功后，错误 URL 仍会留下黑屏，因为 libVLC 的网络和解码错误发生在内部线程。我在 PlayerController 层抽象 Opening、Buffering、Error 等事件，LibVlcPlayer 负责订阅和生命周期解绑，QtClientController 再通过 queued invoke 回到主线程。同时用 generation 隔离旧会话迟到事件，并在播放失败后离开房间，避免无效进度污染同步测量。</w:t>
       </w:r>
     </w:p>
     <w:p>
       <w:pPr>
-        <w:pStyle w:val="ListNumber"/>
+        <w:spacing w:before="0" w:after="120" w:line="300" w:lineRule="auto"/>
       </w:pPr>
       <w:r>
         <w:rPr>
@@ -6829,7 +7350,15 @@
           <w:color w:val="1E2630"/>
           <w:sz w:val="21"/>
         </w:rPr>
-        <w:t>SyncServer::processLine：controlCommandMutex 如何统一 Room、广播、epoch 和 REPORT 的并发顺序。</w:t>
+        <w:t>第八段可以这样说明公网稳定性：版本部署后，公网扫描连接在 JOIN 前断开，server 没有打印 send 错误却整体退出。我先用 10061、ss 和 tmux 输出确认监听进程消失，再通过退出码 141 定位为 SIGPIPE。根因是 Windows send 返回错误，而 Linux 默认信号会在错误分支执行前终止进程。临时用 shell 忽略 PIPE 恢复服务，正式修复则把 sendSocket 下沉到跨平台网络层，Linux 使用 MSG_NOSIGNAL。随后用 socketpair 回归和云端 20 次 TCP RST 复验，确认第三方异常流量只能损失单条连接，不能终止整个服务。</w:t>
+      </w:r>
+    </w:p>
+    <w:p>
+      <w:pPr>
+        <w:pStyle w:val="Heading1"/>
+      </w:pPr>
+      <w:r>
+        <w:t>9. 后续学习重点</w:t>
       </w:r>
     </w:p>
     <w:p>
@@ -6842,7 +7371,7 @@
           <w:color w:val="1E2630"/>
           <w:sz w:val="21"/>
         </w:rPr>
-        <w:t>Room::getEstimatedStateLocked：服务器如何用基准位置与 steady_clock 维护权威状态。</w:t>
+        <w:t>SyncClientSession：如何把 UI/CLI 与网络、协议、播放器并发解耦。</w:t>
       </w:r>
     </w:p>
     <w:p>
@@ -6855,7 +7384,7 @@
           <w:color w:val="1E2630"/>
           <w:sz w:val="21"/>
         </w:rPr>
-        <w:t>SyncMetricsCollector::recordPongReceived：为什么 RTT 可以只用 server 自己的时钟计算。</w:t>
+        <w:t>QtClientController：为什么慢操作放到 worker thread，QWidget 更新必须回到 UI 线程。</w:t>
       </w:r>
     </w:p>
     <w:p>
@@ -6868,7 +7397,7 @@
           <w:color w:val="1E2630"/>
           <w:sz w:val="21"/>
         </w:rPr>
-        <w:t>SyncClientSession 的 playerMutex/sendMutex：多个线程如何安全共享播放器和同一个 TCP 字节流。</w:t>
+        <w:t>QObject signal、QMetaObject::invokeMethod 与 QueuedConnection 的线程边界。</w:t>
       </w:r>
     </w:p>
     <w:p>
@@ -6881,7 +7410,7 @@
           <w:color w:val="1E2630"/>
           <w:sz w:val="21"/>
         </w:rPr>
-        <w:t>SyncCorrectionCoordinator：pending 命令、超时、错误 client/epoch、重复 ACK 和断开清理如何构成命令生命周期。</w:t>
+        <w:t>libvlc_media_player_set_hwnd：第三方播放器如何嵌入 Qt 原生窗口。</w:t>
       </w:r>
     </w:p>
     <w:p>
@@ -6894,7 +7423,7 @@
           <w:color w:val="1E2630"/>
           <w:sz w:val="21"/>
         </w:rPr>
-        <w:t>SyncCorrectionExecutor：为什么把播放器安全门从 Windows 会话层抽出，才能用 MockPlayer 做 Linux/Windows 同一套回归。</w:t>
+        <w:t>libvlc_event_attach/detach：异步第三方回调的订阅、线程边界和对象生命周期。</w:t>
       </w:r>
     </w:p>
     <w:p>
@@ -6907,7 +7436,7 @@
           <w:color w:val="1E2630"/>
           <w:sz w:val="21"/>
         </w:rPr>
-        <w:t>CONTROL epoch：为什么本地操作也要等待 server 回显，以及 epoch gap 为什么应视为不可继续的协议错误。</w:t>
+        <w:t>PlayerEvent 抽象：为什么底层事件要先翻译成领域类型，再交给 Qt 展示。</w:t>
       </w:r>
     </w:p>
     <w:p>
@@ -6920,7 +7449,7 @@
           <w:color w:val="1E2630"/>
           <w:sz w:val="21"/>
         </w:rPr>
-        <w:t>目标 client 级冷却：为什么多人房间不能只按 pair 冷却。</w:t>
+        <w:t>lifecycleGeneration：如何阻止旧播放器排队中的回调影响一次新的连接。</w:t>
       </w:r>
     </w:p>
     <w:p>
@@ -6933,15 +7462,7 @@
           <w:color w:val="1E2630"/>
           <w:sz w:val="21"/>
         </w:rPr>
-        <w:t>MetricLogger：当指标跨多个 cpp 产生时，为什么每个类各自一把日志锁仍然不够。</w:t>
-      </w:r>
-    </w:p>
-    <w:p>
-      <w:pPr>
-        <w:pStyle w:val="Heading1"/>
-      </w:pPr>
-      <w:r>
-        <w:t>10. 后续工程路线</w:t>
+        <w:t>CMake 的可选目标、find_package、AUTOMOC 和 POST_BUILD runtime 部署。</w:t>
       </w:r>
     </w:p>
     <w:p>
@@ -6954,7 +7475,327 @@
           <w:color w:val="1E2630"/>
           <w:sz w:val="21"/>
         </w:rPr>
-        <w:t>提交并推送最小自动校正闭环，随后统一部署新版 Linux server，避免客户端与旧协议 server 混用。</w:t>
+        <w:t>evaluateSyncCorrection：如何用提前返回把安全门写成可读、可测试的纯决策函数。</w:t>
+      </w:r>
+    </w:p>
+    <w:p>
+      <w:pPr>
+        <w:pStyle w:val="ListNumber"/>
+      </w:pPr>
+      <w:r>
+        <w:rPr>
+          <w:rFonts w:ascii="Microsoft YaHei" w:hAnsi="Microsoft YaHei" w:eastAsia="Microsoft YaHei"/>
+          <w:color w:val="1E2630"/>
+          <w:sz w:val="21"/>
+        </w:rPr>
+        <w:t>calculateDirectionAgreementPercent：为什么偏差大小之外还必须验证方向稳定。</w:t>
+      </w:r>
+    </w:p>
+    <w:p>
+      <w:pPr>
+        <w:pStyle w:val="ListNumber"/>
+      </w:pPr>
+      <w:r>
+        <w:rPr>
+          <w:rFonts w:ascii="Microsoft YaHei" w:hAnsi="Microsoft YaHei" w:eastAsia="Microsoft YaHei"/>
+          <w:color w:val="1E2630"/>
+          <w:sz w:val="21"/>
+        </w:rPr>
+        <w:t>PairWindowStats 的建议去重与模拟冷却：状态为什么属于 pair+epoch，而不是某个 client。</w:t>
+      </w:r>
+    </w:p>
+    <w:p>
+      <w:pPr>
+        <w:pStyle w:val="ListNumber"/>
+      </w:pPr>
+      <w:r>
+        <w:rPr>
+          <w:rFonts w:ascii="Microsoft YaHei" w:hAnsi="Microsoft YaHei" w:eastAsia="Microsoft YaHei"/>
+          <w:color w:val="1E2630"/>
+          <w:sz w:val="21"/>
+        </w:rPr>
+        <w:t>策略单元测试：如何用输入夹具覆盖安全门和正负方向，而不启动网络与播放器。</w:t>
+      </w:r>
+    </w:p>
+    <w:p>
+      <w:pPr>
+        <w:pStyle w:val="ListNumber"/>
+      </w:pPr>
+      <w:r>
+        <w:rPr>
+          <w:rFonts w:ascii="Microsoft YaHei" w:hAnsi="Microsoft YaHei" w:eastAsia="Microsoft YaHei"/>
+          <w:color w:val="1E2630"/>
+          <w:sz w:val="21"/>
+        </w:rPr>
+        <w:t>SyncServer 的 accept 初始化临界区：为什么 addClient、getSnapshot、send 必须与控制命令共用顺序锁。</w:t>
+      </w:r>
+    </w:p>
+    <w:p>
+      <w:pPr>
+        <w:pStyle w:val="ListNumber"/>
+      </w:pPr>
+      <w:r>
+        <w:rPr>
+          <w:rFonts w:ascii="Microsoft YaHei" w:hAnsi="Microsoft YaHei" w:eastAsia="Microsoft YaHei"/>
+          <w:color w:val="1E2630"/>
+          <w:sz w:val="21"/>
+        </w:rPr>
+        <w:t>SyncClientSession::receiveInitialSnapshot：select 超时、PING 兼容和 TCP 多读缓冲如何组成握手状态机。</w:t>
+      </w:r>
+    </w:p>
+    <w:p>
+      <w:pPr>
+        <w:pStyle w:val="ListNumber"/>
+      </w:pPr>
+      <w:r>
+        <w:rPr>
+          <w:rFonts w:ascii="Microsoft YaHei" w:hAnsi="Microsoft YaHei" w:eastAsia="Microsoft YaHei"/>
+          <w:color w:val="1E2630"/>
+          <w:sz w:val="21"/>
+        </w:rPr>
+        <w:t>SyncClientSession::applyInitialSnapshot：播放器准备、毫秒 seek 和 Playing 状态经过时间补偿。</w:t>
+      </w:r>
+    </w:p>
+    <w:p>
+      <w:pPr>
+        <w:pStyle w:val="ListNumber"/>
+      </w:pPr>
+      <w:r>
+        <w:rPr>
+          <w:rFonts w:ascii="Microsoft YaHei" w:hAnsi="Microsoft YaHei" w:eastAsia="Microsoft YaHei"/>
+          <w:color w:val="1E2630"/>
+          <w:sz w:val="21"/>
+        </w:rPr>
+        <w:t>Room::getSnapshot：如何在同一把锁下形成 state+epoch 的一致快照。</w:t>
+      </w:r>
+    </w:p>
+    <w:p>
+      <w:pPr>
+        <w:pStyle w:val="ListNumber"/>
+      </w:pPr>
+      <w:r>
+        <w:rPr>
+          <w:rFonts w:ascii="Microsoft YaHei" w:hAnsi="Microsoft YaHei" w:eastAsia="Microsoft YaHei"/>
+          <w:color w:val="1E2630"/>
+          <w:sz w:val="21"/>
+        </w:rPr>
+        <w:t>SyncMetricsCollector::recordProgressReport：共享状态、快照、时间投影和日志输出如何分层。</w:t>
+      </w:r>
+    </w:p>
+    <w:p>
+      <w:pPr>
+        <w:pStyle w:val="ListNumber"/>
+      </w:pPr>
+      <w:r>
+        <w:rPr>
+          <w:rFonts w:ascii="Microsoft YaHei" w:hAnsi="Microsoft YaHei" w:eastAsia="Microsoft YaHei"/>
+          <w:color w:val="1E2630"/>
+          <w:sz w:val="21"/>
+        </w:rPr>
+        <w:t>projectPositionToServerTime：为什么 Playing 才能按经过时间推进。</w:t>
+      </w:r>
+    </w:p>
+    <w:p>
+      <w:pPr>
+        <w:pStyle w:val="ListNumber"/>
+      </w:pPr>
+      <w:r>
+        <w:rPr>
+          <w:rFonts w:ascii="Microsoft YaHei" w:hAnsi="Microsoft YaHei" w:eastAsia="Microsoft YaHei"/>
+          <w:color w:val="1E2630"/>
+          <w:sz w:val="21"/>
+        </w:rPr>
+        <w:t>SyncMetricsCollector::beginControlEpoch：为什么 RTT 保留，而播放偏差必须按控制周期重置。</w:t>
+      </w:r>
+    </w:p>
+    <w:p>
+      <w:pPr>
+        <w:pStyle w:val="ListNumber"/>
+      </w:pPr>
+      <w:r>
+        <w:rPr>
+          <w:rFonts w:ascii="Microsoft YaHei" w:hAnsi="Microsoft YaHei" w:eastAsia="Microsoft YaHei"/>
+          <w:color w:val="1E2630"/>
+          <w:sz w:val="21"/>
+        </w:rPr>
+        <w:t>medianOf / percentile95OfAbsoluteDiffs：稳健统计如何减少离群样本误导。</w:t>
+      </w:r>
+    </w:p>
+    <w:p>
+      <w:pPr>
+        <w:pStyle w:val="ListNumber"/>
+      </w:pPr>
+      <w:r>
+        <w:rPr>
+          <w:rFonts w:ascii="Microsoft YaHei" w:hAnsi="Microsoft YaHei" w:eastAsia="Microsoft YaHei"/>
+          <w:color w:val="1E2630"/>
+          <w:sz w:val="21"/>
+        </w:rPr>
+        <w:t>SyncServer::processLine：controlCommandMutex 如何统一 Room、广播、epoch 和 REPORT 的并发顺序。</w:t>
+      </w:r>
+    </w:p>
+    <w:p>
+      <w:pPr>
+        <w:pStyle w:val="ListNumber"/>
+      </w:pPr>
+      <w:r>
+        <w:rPr>
+          <w:rFonts w:ascii="Microsoft YaHei" w:hAnsi="Microsoft YaHei" w:eastAsia="Microsoft YaHei"/>
+          <w:color w:val="1E2630"/>
+          <w:sz w:val="21"/>
+        </w:rPr>
+        <w:t>Room::getEstimatedStateLocked：服务器如何用基准位置与 steady_clock 维护权威状态。</w:t>
+      </w:r>
+    </w:p>
+    <w:p>
+      <w:pPr>
+        <w:pStyle w:val="ListNumber"/>
+      </w:pPr>
+      <w:r>
+        <w:rPr>
+          <w:rFonts w:ascii="Microsoft YaHei" w:hAnsi="Microsoft YaHei" w:eastAsia="Microsoft YaHei"/>
+          <w:color w:val="1E2630"/>
+          <w:sz w:val="21"/>
+        </w:rPr>
+        <w:t>SyncMetricsCollector::recordPongReceived：为什么 RTT 可以只用 server 自己的时钟计算。</w:t>
+      </w:r>
+    </w:p>
+    <w:p>
+      <w:pPr>
+        <w:pStyle w:val="ListNumber"/>
+      </w:pPr>
+      <w:r>
+        <w:rPr>
+          <w:rFonts w:ascii="Microsoft YaHei" w:hAnsi="Microsoft YaHei" w:eastAsia="Microsoft YaHei"/>
+          <w:color w:val="1E2630"/>
+          <w:sz w:val="21"/>
+        </w:rPr>
+        <w:t>SyncClientSession 的 playerMutex/sendMutex：多个线程如何安全共享播放器和同一个 TCP 字节流。</w:t>
+      </w:r>
+    </w:p>
+    <w:p>
+      <w:pPr>
+        <w:pStyle w:val="ListNumber"/>
+      </w:pPr>
+      <w:r>
+        <w:rPr>
+          <w:rFonts w:ascii="Microsoft YaHei" w:hAnsi="Microsoft YaHei" w:eastAsia="Microsoft YaHei"/>
+          <w:color w:val="1E2630"/>
+          <w:sz w:val="21"/>
+        </w:rPr>
+        <w:t>SyncCorrectionCoordinator：pending 命令、超时、错误 client/epoch、重复 ACK 和断开清理如何构成命令生命周期。</w:t>
+      </w:r>
+    </w:p>
+    <w:p>
+      <w:pPr>
+        <w:pStyle w:val="ListNumber"/>
+      </w:pPr>
+      <w:r>
+        <w:rPr>
+          <w:rFonts w:ascii="Microsoft YaHei" w:hAnsi="Microsoft YaHei" w:eastAsia="Microsoft YaHei"/>
+          <w:color w:val="1E2630"/>
+          <w:sz w:val="21"/>
+        </w:rPr>
+        <w:t>SyncCorrectionExecutor：为什么把播放器安全门从 Windows 会话层抽出，才能用 MockPlayer 做 Linux/Windows 同一套回归。</w:t>
+      </w:r>
+    </w:p>
+    <w:p>
+      <w:pPr>
+        <w:pStyle w:val="ListNumber"/>
+      </w:pPr>
+      <w:r>
+        <w:rPr>
+          <w:rFonts w:ascii="Microsoft YaHei" w:hAnsi="Microsoft YaHei" w:eastAsia="Microsoft YaHei"/>
+          <w:color w:val="1E2630"/>
+          <w:sz w:val="21"/>
+        </w:rPr>
+        <w:t>CONTROL epoch：为什么本地操作也要等待 server 回显，以及 epoch gap 为什么应视为不可继续的协议错误。</w:t>
+      </w:r>
+    </w:p>
+    <w:p>
+      <w:pPr>
+        <w:pStyle w:val="ListNumber"/>
+      </w:pPr>
+      <w:r>
+        <w:rPr>
+          <w:rFonts w:ascii="Microsoft YaHei" w:hAnsi="Microsoft YaHei" w:eastAsia="Microsoft YaHei"/>
+          <w:color w:val="1E2630"/>
+          <w:sz w:val="21"/>
+        </w:rPr>
+        <w:t>目标 client 级冷却：为什么多人房间不能只按 pair 冷却。</w:t>
+      </w:r>
+    </w:p>
+    <w:p>
+      <w:pPr>
+        <w:pStyle w:val="ListNumber"/>
+      </w:pPr>
+      <w:r>
+        <w:rPr>
+          <w:rFonts w:ascii="Microsoft YaHei" w:hAnsi="Microsoft YaHei" w:eastAsia="Microsoft YaHei"/>
+          <w:color w:val="1E2630"/>
+          <w:sz w:val="21"/>
+        </w:rPr>
+        <w:t>MetricLogger：当指标跨多个 cpp 产生时，为什么每个类各自一把日志锁仍然不够。</w:t>
+      </w:r>
+    </w:p>
+    <w:p>
+      <w:pPr>
+        <w:pStyle w:val="ListNumber"/>
+      </w:pPr>
+      <w:r>
+        <w:rPr>
+          <w:rFonts w:ascii="Microsoft YaHei" w:hAnsi="Microsoft YaHei" w:eastAsia="Microsoft YaHei"/>
+          <w:color w:val="1E2630"/>
+          <w:sz w:val="21"/>
+        </w:rPr>
+        <w:t>Linux SIGPIPE：为什么 send 的返回值检查仍可能来不及执行，以及进程退出码 141 如何形成。</w:t>
+      </w:r>
+    </w:p>
+    <w:p>
+      <w:pPr>
+        <w:pStyle w:val="ListNumber"/>
+      </w:pPr>
+      <w:r>
+        <w:rPr>
+          <w:rFonts w:ascii="Microsoft YaHei" w:hAnsi="Microsoft YaHei" w:eastAsia="Microsoft YaHei"/>
+          <w:color w:val="1E2630"/>
+          <w:sz w:val="21"/>
+        </w:rPr>
+        <w:t>晚加入稳定窗口：为什么 SNAPSHOT 已经包含当前进度，libVLC 仍可能短暂上报 0 ms 或留下 421-537 ms 偏差。</w:t>
+      </w:r>
+    </w:p>
+    <w:p>
+      <w:pPr>
+        <w:pStyle w:val="ListNumber"/>
+      </w:pPr>
+      <w:r>
+        <w:rPr>
+          <w:rFonts w:ascii="Microsoft YaHei" w:hAnsi="Microsoft YaHei" w:eastAsia="Microsoft YaHei"/>
+          <w:color w:val="1E2630"/>
+          <w:sz w:val="21"/>
+        </w:rPr>
+        <w:t>故障注入下的 RTT：为什么暂停整个进程会同时阻塞 PONG，累计平均值为何不适合作为实时网络基线。</w:t>
+      </w:r>
+    </w:p>
+    <w:p>
+      <w:pPr>
+        <w:pStyle w:val="ListNumber"/>
+      </w:pPr>
+      <w:r>
+        <w:rPr>
+          <w:rFonts w:ascii="Microsoft YaHei" w:hAnsi="Microsoft YaHei" w:eastAsia="Microsoft YaHei"/>
+          <w:color w:val="1E2630"/>
+          <w:sz w:val="21"/>
+        </w:rPr>
+        <w:t>metrics 会话生命周期：为什么 Room 清空时业务 epoch 和统计 epoch 必须一起重置。</w:t>
+      </w:r>
+    </w:p>
+    <w:p>
+      <w:pPr>
+        <w:pStyle w:val="Heading1"/>
+      </w:pPr>
+      <w:r>
+        <w:t>10. 后续工程路线</w:t>
       </w:r>
     </w:p>
     <w:p>
@@ -7069,7 +7910,7 @@
           <w:color w:val="1E2630"/>
           <w:sz w:val="21"/>
         </w:rPr>
-        <w:t>最小自动校正已经完成代码闭环与 Windows/Linux 回归：普通控制具备权威 epoch，server 能定向派发带 command id 的 CORRECT，client 安全执行并返回结构化结果。下一步不再扩功能，而是 review/提交后统一部署云端，用两台真实电脑验证校正方向、频率、回执和体感，再根据数据调整阈值。</w:t>
+        <w:t>最小自动校正已完成可靠性收口和第二轮云端单机双实例验收：Linux SIGPIPE、metrics 会话重置、滚动 RTT 基线和晚加入位置确认均已实现并通过回归。两次故障注入分别从约 22.1 秒和 8.1 秒偏差恢复，最终 Playing 窗口中位偏差约 88 ms。下一步用两台真实电脑复测相同场景，再根据跨设备数据决定是否为 250-750 ms 中等偏差引入温和校正。</w:t>
       </w:r>
     </w:p>
     <w:sectPr>

</xml_diff>

<commit_message>
observability: add structured session telemetry
</commit_message>
<xml_diff>
--- a/docs/SyncCinema_Engineering_Journal.docx
+++ b/docs/SyncCinema_Engineering_Journal.docx
@@ -165,7 +165,7 @@
                 <w:color w:val="1E2630"/>
                 <w:sz w:val="19"/>
               </w:rPr>
-              <w:t>feature/sync-correction-execution</w:t>
+              <w:t>feature/observability</w:t>
             </w:r>
           </w:p>
         </w:tc>
@@ -206,7 +206,7 @@
                 <w:color w:val="1E2630"/>
                 <w:sz w:val="19"/>
               </w:rPr>
-              <w:t>c89e021 + 云端单机双实例实验</w:t>
+              <w:t>b960333 + 同步校正可靠性收口</w:t>
             </w:r>
           </w:p>
         </w:tc>
@@ -247,7 +247,7 @@
                 <w:color w:val="1E2630"/>
                 <w:sz w:val="19"/>
               </w:rPr>
-              <w:t>自动同步校正云端验收与问题识别</w:t>
+              <w:t>可观测性指标契约与结构化会话事件</w:t>
             </w:r>
           </w:p>
         </w:tc>
@@ -288,7 +288,7 @@
                 <w:color w:val="1E2630"/>
                 <w:sz w:val="19"/>
               </w:rPr>
-              <w:t>2026-09-25</w:t>
+              <w:t>2026-10-21</w:t>
             </w:r>
           </w:p>
         </w:tc>
@@ -7243,10 +7243,10 @@
     </w:p>
     <w:p>
       <w:pPr>
-        <w:pStyle w:val="Heading1"/>
-      </w:pPr>
-      <w:r>
-        <w:t>8. 面试表达模板</w:t>
+        <w:pStyle w:val="Heading2"/>
+      </w:pPr>
+      <w:r>
+        <w:t>7.15 可观测性第一阶段：指标契约与会话事件</w:t>
       </w:r>
     </w:p>
     <w:p>
@@ -7259,12 +7259,12 @@
           <w:color w:val="1E2630"/>
           <w:sz w:val="21"/>
         </w:rPr>
-        <w:t>第一段可以这样说明指标演进：最初我用服务器 Room 的理论时钟评估每个客户端，但公网测试发现两端都可能因 libVLC 缓冲共同落后 Room 几百毫秒，这个指标不能直接代表观众之间不同步。于是我保留 client-to-Room 指标用于诊断，另外缓存每个 client 的最近上报，结合 RTT/2 和 server steady_clock，把异步到达的进度投影到同一时刻后计算 pair_diff。同时过滤陈旧样本和状态不一致样本，并坚持先观测后控制，为后续自动纠偏建立可信数据基础。</w:t>
+        <w:t>2026-10-21 开始把项目从‘能够通过日志人工验证’推进到‘能够用统一数据口径长期衡量’。此前已经有 RTT、pair skew、校正命令和回执等详细 [metric] 行，但缺少稳定 session_id、结构化事件 schema、成功率分母和正式 SLO 定义，因此还不能可靠回答连接成功率、同步良好时间占比或故障趋势。本阶段没有先接 Grafana，而是先固定数据契约，避免把含义不稳定的数字过早做成看板。</w:t>
       </w:r>
     </w:p>
     <w:p>
       <w:pPr>
-        <w:spacing w:before="0" w:after="120" w:line="300" w:lineRule="auto"/>
+        <w:pStyle w:val="ListBullet"/>
       </w:pPr>
       <w:r>
         <w:rPr>
@@ -7272,12 +7272,12 @@
           <w:color w:val="1E2630"/>
           <w:sz w:val="21"/>
         </w:rPr>
-        <w:t>第二段可以这样说明稳健性：公网实测中，两台客户端暂停后只差约 2 ms，但播放时单条日志会出现约 250 ms 的量化台阶。我没有直接按单个样本 seek，而是为每次 PLAY、PAUSE、SEEK 建立独立 epoch，清理旧进度统计但保留 RTT；控制后设置 2 秒稳定期，再用最近 12 个样本的中位数评估典型偏差、P95 观察尾部风险，同时统计连续严重异常。这样未来的校正策略会基于趋势，而不是被播放器异步行为或一次网络抖动误触发。</w:t>
+        <w:t>指标字典：新增 docs/Observability.md，按用户体验和技术黄金信号定义 JOIN 成功率、首帧、初始同步、pair skew、同步良好率、控制应用延迟、校正成功率和校正收敛时间；每项明确分子、分母、排除条件、分位数和第一版目标，禁止只报平均值。</w:t>
       </w:r>
     </w:p>
     <w:p>
       <w:pPr>
-        <w:spacing w:before="0" w:after="120" w:line="300" w:lineRule="auto"/>
+        <w:pStyle w:val="ListBullet"/>
       </w:pPr>
       <w:r>
         <w:rPr>
@@ -7285,12 +7285,12 @@
           <w:color w:val="1E2630"/>
           <w:sz w:val="21"/>
         </w:rPr>
-        <w:t>第三段可以这样说明晚加入：自动纠偏前我先处理了一个确定性更强的问题，即新客户端加入正在播放的房间时会停在 0 秒。我让 Room 统一维护 controlEpoch，新增 SNAPSHOT 消息携带状态、毫秒位置和版本；server 用控制顺序锁把注册、取快照和发送变成一个有序步骤。client 侧实现带超时的握手，能在快照前响应心跳并保留多读字节；真实播放器等待 seekable 后按毫秒定位。同时用 Windows/Linux 核心测试、脚本双客户端和真实 libVLC 三层验证，确保协议、并发顺序和播放器行为都成立。</w:t>
+        <w:t>结构化事件：TelemetryEvent 使用 typed attributes，TelemetryLogger 输出 schema_version=1 的单行 JSON。多线程写入由统一 mutex 串行化；设置 SYNCCINEMA_TELEMETRY_PATH 后追加写入纯 JSONL，并逐条 flush，日志目录无法创建时降级为控制台而不阻止 server 启动。</w:t>
       </w:r>
     </w:p>
     <w:p>
       <w:pPr>
-        <w:spacing w:before="0" w:after="120" w:line="300" w:lineRule="auto"/>
+        <w:pStyle w:val="ListBullet"/>
       </w:pPr>
       <w:r>
         <w:rPr>
@@ -7298,12 +7298,12 @@
           <w:color w:val="1E2630"/>
           <w:sz w:val="21"/>
         </w:rPr>
-        <w:t>第四段可以这样说明控制安全性：有了相对偏差后我没有直接 seek，而是把测量、决策和执行拆成三层。纯策略层按稳定期、窗口、状态、RTT、阈值、方向一致率、连续异常和冷却逐层放行，先用 read_only 建议验证 window_not_ready、persistent_skew、cooldown 的状态序列，再升级为最小执行闭环。server 用权威 CONTROL epoch 统一普通操作顺序，协调器为校正分配 command id 并匹配 ACK；client 再次验证 epoch、状态和 seek 能力后只让落后端向前追赶。这样旧命令、重复回执和 ACK 丢失都不会造成连续误跳。</w:t>
+        <w:t>会话关联：空房间接受首个媒体时生成 UUID v4 session_id；后续同媒体 client 复用该 ID，最后一个 client 离开时返回 session duration 并清空。RoomRemovalResult 同时区分未知 socket、普通离开和真正会话结束，避免重复产生 session_ended。</w:t>
       </w:r>
     </w:p>
     <w:p>
       <w:pPr>
-        <w:spacing w:before="0" w:after="120" w:line="300" w:lineRule="auto"/>
+        <w:pStyle w:val="ListBullet"/>
       </w:pPr>
       <w:r>
         <w:rPr>
@@ -7311,12 +7311,12 @@
           <w:color w:val="1E2630"/>
           <w:sz w:val="21"/>
         </w:rPr>
-        <w:t>第五段可以这样说明客户端工程化：为了让另一台电脑由普通用户直接参与测试，我没有在 Qt 中重写一套网络代码，而是先把旧 Client.cpp 拆成纯 C++ 的 SyncClientSession。CLI 和 Qt 共用快照握手、心跳、广播与进度上报；QtClientController 在后台完成 libVLC 冷启动和连接，再用 queued invoke 回到 UI 线程。视频通过 HWND 嵌入，CMake 把 Qt 目标设为可选并自动部署 Qt/VLC runtime，因此 Linux server 构建路径保持不变。</w:t>
+        <w:t>生命周期事件：server_started、session_started、join_result、client_disconnected 和 session_ended 已接入 server。媒体只记录稳定 media_id，不记录原始 URL 或本地路径；reason 使用有限错误码，避免隐私泄露和 Prometheus 高基数标签。</w:t>
       </w:r>
     </w:p>
     <w:p>
       <w:pPr>
-        <w:spacing w:before="0" w:after="120" w:line="300" w:lineRule="auto"/>
+        <w:pStyle w:val="ListBullet"/>
       </w:pPr>
       <w:r>
         <w:rPr>
@@ -7324,7 +7324,7 @@
           <w:color w:val="1E2630"/>
           <w:sz w:val="21"/>
         </w:rPr>
-        <w:t>第六段可以这样说明媒体一致性：Qt 实测发现切换影片会继承旧 Room 进度，我没有只在 UI 中归零，而是追到协议层补上媒体会话身份。client 先发送 JOIN，server 只有在媒体一致时才注册并返回带身份的快照；活跃房间拒绝不同媒体，最后一位用户离开后重置状态。这样从协议、Room 到 UI 都不会把一部电影的进度错误应用到另一部电影，也为后续带 epoch 的自动校正建立了正确边界。</w:t>
+        <w:t>时间语义：UTC timestamp 只用于检索，duration_ms 仍在同一进程内使用 steady_clock 计算。跨设备控制延迟后续由 server 从接收 CONTROL 到收到各 client APPLIED ACK 计算，不能直接相减两台电脑的系统时间。</w:t>
       </w:r>
     </w:p>
     <w:p>
@@ -7337,33 +7337,33 @@
           <w:color w:val="1E2630"/>
           <w:sz w:val="21"/>
         </w:rPr>
-        <w:t>第七段可以这样说明异步错误治理：最初 openMedia 返回成功后，错误 URL 仍会留下黑屏，因为 libVLC 的网络和解码错误发生在内部线程。我在 PlayerController 层抽象 Opening、Buffering、Error 等事件，LibVlcPlayer 负责订阅和生命周期解绑，QtClientController 再通过 queued invoke 回到主线程。同时用 generation 隔离旧会话迟到事件，并在播放失败后离开房间，避免无效进度污染同步测量。</w:t>
+        <w:t>自动化测试覆盖 JSON 转义与类型保持、100 个 UUID 的格式和唯一性、四线程并发事件不穿行、JSONL 文件追加，以及 Room 在同一会话复用 ID、清空后生成新 ID。Windows Qt/server/核心测试与 WSL Linux server/核心测试均完成构建，CTest 全部通过。当前只完成可靠采集基础，尚未声称 Prometheus 指标、Grafana 看板、首帧和控制 ACK已经落地；下一阶段才会计算会话级汇总和八项核心体验指标。</w:t>
       </w:r>
     </w:p>
     <w:p>
       <w:pPr>
-        <w:spacing w:before="0" w:after="120" w:line="300" w:lineRule="auto"/>
-      </w:pPr>
-      <w:r>
-        <w:rPr>
-          <w:rFonts w:ascii="Microsoft YaHei" w:hAnsi="Microsoft YaHei" w:eastAsia="Microsoft YaHei"/>
-          <w:color w:val="1E2630"/>
-          <w:sz w:val="21"/>
-        </w:rPr>
-        <w:t>第八段可以这样说明公网稳定性：版本部署后，公网扫描连接在 JOIN 前断开，server 没有打印 send 错误却整体退出。我先用 10061、ss 和 tmux 输出确认监听进程消失，再通过退出码 141 定位为 SIGPIPE。根因是 Windows send 返回错误，而 Linux 默认信号会在错误分支执行前终止进程。临时用 shell 忽略 PIPE 恢复服务，正式修复则把 sendSocket 下沉到跨平台网络层，Linux 使用 MSG_NOSIGNAL。随后用 socketpair 回归和云端 20 次 TCP RST 复验，确认第三方异常流量只能损失单条连接，不能终止整个服务。</w:t>
+        <w:pStyle w:val="Heading1"/>
+      </w:pPr>
+      <w:r>
+        <w:t>8. 面试表达模板</w:t>
       </w:r>
     </w:p>
     <w:p>
       <w:pPr>
-        <w:pStyle w:val="Heading1"/>
-      </w:pPr>
-      <w:r>
-        <w:t>9. 后续学习重点</w:t>
+        <w:spacing w:before="0" w:after="120" w:line="300" w:lineRule="auto"/>
+      </w:pPr>
+      <w:r>
+        <w:rPr>
+          <w:rFonts w:ascii="Microsoft YaHei" w:hAnsi="Microsoft YaHei" w:eastAsia="Microsoft YaHei"/>
+          <w:color w:val="1E2630"/>
+          <w:sz w:val="21"/>
+        </w:rPr>
+        <w:t>第一段可以这样说明指标演进：最初我用服务器 Room 的理论时钟评估每个客户端，但公网测试发现两端都可能因 libVLC 缓冲共同落后 Room 几百毫秒，这个指标不能直接代表观众之间不同步。于是我保留 client-to-Room 指标用于诊断，另外缓存每个 client 的最近上报，结合 RTT/2 和 server steady_clock，把异步到达的进度投影到同一时刻后计算 pair_diff。同时过滤陈旧样本和状态不一致样本，并坚持先观测后控制，为后续自动纠偏建立可信数据基础。</w:t>
       </w:r>
     </w:p>
     <w:p>
       <w:pPr>
-        <w:pStyle w:val="ListNumber"/>
+        <w:spacing w:before="0" w:after="120" w:line="300" w:lineRule="auto"/>
       </w:pPr>
       <w:r>
         <w:rPr>
@@ -7371,12 +7371,12 @@
           <w:color w:val="1E2630"/>
           <w:sz w:val="21"/>
         </w:rPr>
-        <w:t>SyncClientSession：如何把 UI/CLI 与网络、协议、播放器并发解耦。</w:t>
+        <w:t>第二段可以这样说明稳健性：公网实测中，两台客户端暂停后只差约 2 ms，但播放时单条日志会出现约 250 ms 的量化台阶。我没有直接按单个样本 seek，而是为每次 PLAY、PAUSE、SEEK 建立独立 epoch，清理旧进度统计但保留 RTT；控制后设置 2 秒稳定期，再用最近 12 个样本的中位数评估典型偏差、P95 观察尾部风险，同时统计连续严重异常。这样未来的校正策略会基于趋势，而不是被播放器异步行为或一次网络抖动误触发。</w:t>
       </w:r>
     </w:p>
     <w:p>
       <w:pPr>
-        <w:pStyle w:val="ListNumber"/>
+        <w:spacing w:before="0" w:after="120" w:line="300" w:lineRule="auto"/>
       </w:pPr>
       <w:r>
         <w:rPr>
@@ -7384,12 +7384,12 @@
           <w:color w:val="1E2630"/>
           <w:sz w:val="21"/>
         </w:rPr>
-        <w:t>QtClientController：为什么慢操作放到 worker thread，QWidget 更新必须回到 UI 线程。</w:t>
+        <w:t>第三段可以这样说明晚加入：自动纠偏前我先处理了一个确定性更强的问题，即新客户端加入正在播放的房间时会停在 0 秒。我让 Room 统一维护 controlEpoch，新增 SNAPSHOT 消息携带状态、毫秒位置和版本；server 用控制顺序锁把注册、取快照和发送变成一个有序步骤。client 侧实现带超时的握手，能在快照前响应心跳并保留多读字节；真实播放器等待 seekable 后按毫秒定位。同时用 Windows/Linux 核心测试、脚本双客户端和真实 libVLC 三层验证，确保协议、并发顺序和播放器行为都成立。</w:t>
       </w:r>
     </w:p>
     <w:p>
       <w:pPr>
-        <w:pStyle w:val="ListNumber"/>
+        <w:spacing w:before="0" w:after="120" w:line="300" w:lineRule="auto"/>
       </w:pPr>
       <w:r>
         <w:rPr>
@@ -7397,12 +7397,12 @@
           <w:color w:val="1E2630"/>
           <w:sz w:val="21"/>
         </w:rPr>
-        <w:t>QObject signal、QMetaObject::invokeMethod 与 QueuedConnection 的线程边界。</w:t>
+        <w:t>第四段可以这样说明控制安全性：有了相对偏差后我没有直接 seek，而是把测量、决策和执行拆成三层。纯策略层按稳定期、窗口、状态、RTT、阈值、方向一致率、连续异常和冷却逐层放行，先用 read_only 建议验证 window_not_ready、persistent_skew、cooldown 的状态序列，再升级为最小执行闭环。server 用权威 CONTROL epoch 统一普通操作顺序，协调器为校正分配 command id 并匹配 ACK；client 再次验证 epoch、状态和 seek 能力后只让落后端向前追赶。这样旧命令、重复回执和 ACK 丢失都不会造成连续误跳。</w:t>
       </w:r>
     </w:p>
     <w:p>
       <w:pPr>
-        <w:pStyle w:val="ListNumber"/>
+        <w:spacing w:before="0" w:after="120" w:line="300" w:lineRule="auto"/>
       </w:pPr>
       <w:r>
         <w:rPr>
@@ -7410,12 +7410,12 @@
           <w:color w:val="1E2630"/>
           <w:sz w:val="21"/>
         </w:rPr>
-        <w:t>libvlc_media_player_set_hwnd：第三方播放器如何嵌入 Qt 原生窗口。</w:t>
+        <w:t>第五段可以这样说明客户端工程化：为了让另一台电脑由普通用户直接参与测试，我没有在 Qt 中重写一套网络代码，而是先把旧 Client.cpp 拆成纯 C++ 的 SyncClientSession。CLI 和 Qt 共用快照握手、心跳、广播与进度上报；QtClientController 在后台完成 libVLC 冷启动和连接，再用 queued invoke 回到 UI 线程。视频通过 HWND 嵌入，CMake 把 Qt 目标设为可选并自动部署 Qt/VLC runtime，因此 Linux server 构建路径保持不变。</w:t>
       </w:r>
     </w:p>
     <w:p>
       <w:pPr>
-        <w:pStyle w:val="ListNumber"/>
+        <w:spacing w:before="0" w:after="120" w:line="300" w:lineRule="auto"/>
       </w:pPr>
       <w:r>
         <w:rPr>
@@ -7423,12 +7423,12 @@
           <w:color w:val="1E2630"/>
           <w:sz w:val="21"/>
         </w:rPr>
-        <w:t>libvlc_event_attach/detach：异步第三方回调的订阅、线程边界和对象生命周期。</w:t>
+        <w:t>第六段可以这样说明媒体一致性：Qt 实测发现切换影片会继承旧 Room 进度，我没有只在 UI 中归零，而是追到协议层补上媒体会话身份。client 先发送 JOIN，server 只有在媒体一致时才注册并返回带身份的快照；活跃房间拒绝不同媒体，最后一位用户离开后重置状态。这样从协议、Room 到 UI 都不会把一部电影的进度错误应用到另一部电影，也为后续带 epoch 的自动校正建立了正确边界。</w:t>
       </w:r>
     </w:p>
     <w:p>
       <w:pPr>
-        <w:pStyle w:val="ListNumber"/>
+        <w:spacing w:before="0" w:after="120" w:line="300" w:lineRule="auto"/>
       </w:pPr>
       <w:r>
         <w:rPr>
@@ -7436,12 +7436,12 @@
           <w:color w:val="1E2630"/>
           <w:sz w:val="21"/>
         </w:rPr>
-        <w:t>PlayerEvent 抽象：为什么底层事件要先翻译成领域类型，再交给 Qt 展示。</w:t>
+        <w:t>第七段可以这样说明异步错误治理：最初 openMedia 返回成功后，错误 URL 仍会留下黑屏，因为 libVLC 的网络和解码错误发生在内部线程。我在 PlayerController 层抽象 Opening、Buffering、Error 等事件，LibVlcPlayer 负责订阅和生命周期解绑，QtClientController 再通过 queued invoke 回到主线程。同时用 generation 隔离旧会话迟到事件，并在播放失败后离开房间，避免无效进度污染同步测量。</w:t>
       </w:r>
     </w:p>
     <w:p>
       <w:pPr>
-        <w:pStyle w:val="ListNumber"/>
+        <w:spacing w:before="0" w:after="120" w:line="300" w:lineRule="auto"/>
       </w:pPr>
       <w:r>
         <w:rPr>
@@ -7449,12 +7449,12 @@
           <w:color w:val="1E2630"/>
           <w:sz w:val="21"/>
         </w:rPr>
-        <w:t>lifecycleGeneration：如何阻止旧播放器排队中的回调影响一次新的连接。</w:t>
+        <w:t>第八段可以这样说明公网稳定性：版本部署后，公网扫描连接在 JOIN 前断开，server 没有打印 send 错误却整体退出。我先用 10061、ss 和 tmux 输出确认监听进程消失，再通过退出码 141 定位为 SIGPIPE。根因是 Windows send 返回错误，而 Linux 默认信号会在错误分支执行前终止进程。临时用 shell 忽略 PIPE 恢复服务，正式修复则把 sendSocket 下沉到跨平台网络层，Linux 使用 MSG_NOSIGNAL。随后用 socketpair 回归和云端 20 次 TCP RST 复验，确认第三方异常流量只能损失单条连接，不能终止整个服务。</w:t>
       </w:r>
     </w:p>
     <w:p>
       <w:pPr>
-        <w:pStyle w:val="ListNumber"/>
+        <w:spacing w:before="0" w:after="120" w:line="300" w:lineRule="auto"/>
       </w:pPr>
       <w:r>
         <w:rPr>
@@ -7462,20 +7462,15 @@
           <w:color w:val="1E2630"/>
           <w:sz w:val="21"/>
         </w:rPr>
-        <w:t>CMake 的可选目标、find_package、AUTOMOC 和 POST_BUILD runtime 部署。</w:t>
+        <w:t>第九段可以这样说明产品指标：我把观测分成用户体验、同步正确性和系统健康三层。用户体验看 JOIN 成功率、首帧和无崩溃会话；同步正确性看有效 pair skew 的 P50/P95/P99、同步良好时间占比、校正成功率和收敛时间；技术侧按 latency、traffic、errors、saturation 四个黄金信号组织。实现时先定义分子分母、settling 排除条件和 SLO，再用 session_id 关联 JSONL 事件，避免只有零散日志却无法形成趋势。跨设备耗时不直接比较墙上时间，而由 server steady_clock 测量命令到 ACK 的闭环。</w:t>
       </w:r>
     </w:p>
     <w:p>
       <w:pPr>
-        <w:pStyle w:val="ListNumber"/>
-      </w:pPr>
-      <w:r>
-        <w:rPr>
-          <w:rFonts w:ascii="Microsoft YaHei" w:hAnsi="Microsoft YaHei" w:eastAsia="Microsoft YaHei"/>
-          <w:color w:val="1E2630"/>
-          <w:sz w:val="21"/>
-        </w:rPr>
-        <w:t>evaluateSyncCorrection：如何用提前返回把安全门写成可读、可测试的纯决策函数。</w:t>
+        <w:pStyle w:val="Heading1"/>
+      </w:pPr>
+      <w:r>
+        <w:t>9. 后续学习重点</w:t>
       </w:r>
     </w:p>
     <w:p>
@@ -7488,7 +7483,7 @@
           <w:color w:val="1E2630"/>
           <w:sz w:val="21"/>
         </w:rPr>
-        <w:t>calculateDirectionAgreementPercent：为什么偏差大小之外还必须验证方向稳定。</w:t>
+        <w:t>SyncClientSession：如何把 UI/CLI 与网络、协议、播放器并发解耦。</w:t>
       </w:r>
     </w:p>
     <w:p>
@@ -7501,7 +7496,7 @@
           <w:color w:val="1E2630"/>
           <w:sz w:val="21"/>
         </w:rPr>
-        <w:t>PairWindowStats 的建议去重与模拟冷却：状态为什么属于 pair+epoch，而不是某个 client。</w:t>
+        <w:t>QtClientController：为什么慢操作放到 worker thread，QWidget 更新必须回到 UI 线程。</w:t>
       </w:r>
     </w:p>
     <w:p>
@@ -7514,7 +7509,7 @@
           <w:color w:val="1E2630"/>
           <w:sz w:val="21"/>
         </w:rPr>
-        <w:t>策略单元测试：如何用输入夹具覆盖安全门和正负方向，而不启动网络与播放器。</w:t>
+        <w:t>QObject signal、QMetaObject::invokeMethod 与 QueuedConnection 的线程边界。</w:t>
       </w:r>
     </w:p>
     <w:p>
@@ -7527,7 +7522,7 @@
           <w:color w:val="1E2630"/>
           <w:sz w:val="21"/>
         </w:rPr>
-        <w:t>SyncServer 的 accept 初始化临界区：为什么 addClient、getSnapshot、send 必须与控制命令共用顺序锁。</w:t>
+        <w:t>libvlc_media_player_set_hwnd：第三方播放器如何嵌入 Qt 原生窗口。</w:t>
       </w:r>
     </w:p>
     <w:p>
@@ -7540,7 +7535,7 @@
           <w:color w:val="1E2630"/>
           <w:sz w:val="21"/>
         </w:rPr>
-        <w:t>SyncClientSession::receiveInitialSnapshot：select 超时、PING 兼容和 TCP 多读缓冲如何组成握手状态机。</w:t>
+        <w:t>libvlc_event_attach/detach：异步第三方回调的订阅、线程边界和对象生命周期。</w:t>
       </w:r>
     </w:p>
     <w:p>
@@ -7553,7 +7548,7 @@
           <w:color w:val="1E2630"/>
           <w:sz w:val="21"/>
         </w:rPr>
-        <w:t>SyncClientSession::applyInitialSnapshot：播放器准备、毫秒 seek 和 Playing 状态经过时间补偿。</w:t>
+        <w:t>PlayerEvent 抽象：为什么底层事件要先翻译成领域类型，再交给 Qt 展示。</w:t>
       </w:r>
     </w:p>
     <w:p>
@@ -7566,7 +7561,7 @@
           <w:color w:val="1E2630"/>
           <w:sz w:val="21"/>
         </w:rPr>
-        <w:t>Room::getSnapshot：如何在同一把锁下形成 state+epoch 的一致快照。</w:t>
+        <w:t>lifecycleGeneration：如何阻止旧播放器排队中的回调影响一次新的连接。</w:t>
       </w:r>
     </w:p>
     <w:p>
@@ -7579,7 +7574,7 @@
           <w:color w:val="1E2630"/>
           <w:sz w:val="21"/>
         </w:rPr>
-        <w:t>SyncMetricsCollector::recordProgressReport：共享状态、快照、时间投影和日志输出如何分层。</w:t>
+        <w:t>CMake 的可选目标、find_package、AUTOMOC 和 POST_BUILD runtime 部署。</w:t>
       </w:r>
     </w:p>
     <w:p>
@@ -7592,7 +7587,7 @@
           <w:color w:val="1E2630"/>
           <w:sz w:val="21"/>
         </w:rPr>
-        <w:t>projectPositionToServerTime：为什么 Playing 才能按经过时间推进。</w:t>
+        <w:t>evaluateSyncCorrection：如何用提前返回把安全门写成可读、可测试的纯决策函数。</w:t>
       </w:r>
     </w:p>
     <w:p>
@@ -7605,7 +7600,7 @@
           <w:color w:val="1E2630"/>
           <w:sz w:val="21"/>
         </w:rPr>
-        <w:t>SyncMetricsCollector::beginControlEpoch：为什么 RTT 保留，而播放偏差必须按控制周期重置。</w:t>
+        <w:t>calculateDirectionAgreementPercent：为什么偏差大小之外还必须验证方向稳定。</w:t>
       </w:r>
     </w:p>
     <w:p>
@@ -7618,7 +7613,7 @@
           <w:color w:val="1E2630"/>
           <w:sz w:val="21"/>
         </w:rPr>
-        <w:t>medianOf / percentile95OfAbsoluteDiffs：稳健统计如何减少离群样本误导。</w:t>
+        <w:t>PairWindowStats 的建议去重与模拟冷却：状态为什么属于 pair+epoch，而不是某个 client。</w:t>
       </w:r>
     </w:p>
     <w:p>
@@ -7631,7 +7626,7 @@
           <w:color w:val="1E2630"/>
           <w:sz w:val="21"/>
         </w:rPr>
-        <w:t>SyncServer::processLine：controlCommandMutex 如何统一 Room、广播、epoch 和 REPORT 的并发顺序。</w:t>
+        <w:t>策略单元测试：如何用输入夹具覆盖安全门和正负方向，而不启动网络与播放器。</w:t>
       </w:r>
     </w:p>
     <w:p>
@@ -7644,7 +7639,7 @@
           <w:color w:val="1E2630"/>
           <w:sz w:val="21"/>
         </w:rPr>
-        <w:t>Room::getEstimatedStateLocked：服务器如何用基准位置与 steady_clock 维护权威状态。</w:t>
+        <w:t>SyncServer 的 accept 初始化临界区：为什么 addClient、getSnapshot、send 必须与控制命令共用顺序锁。</w:t>
       </w:r>
     </w:p>
     <w:p>
@@ -7657,7 +7652,7 @@
           <w:color w:val="1E2630"/>
           <w:sz w:val="21"/>
         </w:rPr>
-        <w:t>SyncMetricsCollector::recordPongReceived：为什么 RTT 可以只用 server 自己的时钟计算。</w:t>
+        <w:t>SyncClientSession::receiveInitialSnapshot：select 超时、PING 兼容和 TCP 多读缓冲如何组成握手状态机。</w:t>
       </w:r>
     </w:p>
     <w:p>
@@ -7670,7 +7665,7 @@
           <w:color w:val="1E2630"/>
           <w:sz w:val="21"/>
         </w:rPr>
-        <w:t>SyncClientSession 的 playerMutex/sendMutex：多个线程如何安全共享播放器和同一个 TCP 字节流。</w:t>
+        <w:t>SyncClientSession::applyInitialSnapshot：播放器准备、毫秒 seek 和 Playing 状态经过时间补偿。</w:t>
       </w:r>
     </w:p>
     <w:p>
@@ -7683,7 +7678,7 @@
           <w:color w:val="1E2630"/>
           <w:sz w:val="21"/>
         </w:rPr>
-        <w:t>SyncCorrectionCoordinator：pending 命令、超时、错误 client/epoch、重复 ACK 和断开清理如何构成命令生命周期。</w:t>
+        <w:t>Room::getSnapshot：如何在同一把锁下形成 state+epoch 的一致快照。</w:t>
       </w:r>
     </w:p>
     <w:p>
@@ -7696,7 +7691,7 @@
           <w:color w:val="1E2630"/>
           <w:sz w:val="21"/>
         </w:rPr>
-        <w:t>SyncCorrectionExecutor：为什么把播放器安全门从 Windows 会话层抽出，才能用 MockPlayer 做 Linux/Windows 同一套回归。</w:t>
+        <w:t>SyncMetricsCollector::recordProgressReport：共享状态、快照、时间投影和日志输出如何分层。</w:t>
       </w:r>
     </w:p>
     <w:p>
@@ -7709,7 +7704,7 @@
           <w:color w:val="1E2630"/>
           <w:sz w:val="21"/>
         </w:rPr>
-        <w:t>CONTROL epoch：为什么本地操作也要等待 server 回显，以及 epoch gap 为什么应视为不可继续的协议错误。</w:t>
+        <w:t>projectPositionToServerTime：为什么 Playing 才能按经过时间推进。</w:t>
       </w:r>
     </w:p>
     <w:p>
@@ -7722,7 +7717,7 @@
           <w:color w:val="1E2630"/>
           <w:sz w:val="21"/>
         </w:rPr>
-        <w:t>目标 client 级冷却：为什么多人房间不能只按 pair 冷却。</w:t>
+        <w:t>SyncMetricsCollector::beginControlEpoch：为什么 RTT 保留，而播放偏差必须按控制周期重置。</w:t>
       </w:r>
     </w:p>
     <w:p>
@@ -7735,7 +7730,7 @@
           <w:color w:val="1E2630"/>
           <w:sz w:val="21"/>
         </w:rPr>
-        <w:t>MetricLogger：当指标跨多个 cpp 产生时，为什么每个类各自一把日志锁仍然不够。</w:t>
+        <w:t>medianOf / percentile95OfAbsoluteDiffs：稳健统计如何减少离群样本误导。</w:t>
       </w:r>
     </w:p>
     <w:p>
@@ -7748,7 +7743,7 @@
           <w:color w:val="1E2630"/>
           <w:sz w:val="21"/>
         </w:rPr>
-        <w:t>Linux SIGPIPE：为什么 send 的返回值检查仍可能来不及执行，以及进程退出码 141 如何形成。</w:t>
+        <w:t>SyncServer::processLine：controlCommandMutex 如何统一 Room、广播、epoch 和 REPORT 的并发顺序。</w:t>
       </w:r>
     </w:p>
     <w:p>
@@ -7761,7 +7756,7 @@
           <w:color w:val="1E2630"/>
           <w:sz w:val="21"/>
         </w:rPr>
-        <w:t>晚加入稳定窗口：为什么 SNAPSHOT 已经包含当前进度，libVLC 仍可能短暂上报 0 ms 或留下 421-537 ms 偏差。</w:t>
+        <w:t>Room::getEstimatedStateLocked：服务器如何用基准位置与 steady_clock 维护权威状态。</w:t>
       </w:r>
     </w:p>
     <w:p>
@@ -7774,7 +7769,7 @@
           <w:color w:val="1E2630"/>
           <w:sz w:val="21"/>
         </w:rPr>
-        <w:t>故障注入下的 RTT：为什么暂停整个进程会同时阻塞 PONG，累计平均值为何不适合作为实时网络基线。</w:t>
+        <w:t>SyncMetricsCollector::recordPongReceived：为什么 RTT 可以只用 server 自己的时钟计算。</w:t>
       </w:r>
     </w:p>
     <w:p>
@@ -7787,15 +7782,20 @@
           <w:color w:val="1E2630"/>
           <w:sz w:val="21"/>
         </w:rPr>
-        <w:t>metrics 会话生命周期：为什么 Room 清空时业务 epoch 和统计 epoch 必须一起重置。</w:t>
+        <w:t>SyncClientSession 的 playerMutex/sendMutex：多个线程如何安全共享播放器和同一个 TCP 字节流。</w:t>
       </w:r>
     </w:p>
     <w:p>
       <w:pPr>
-        <w:pStyle w:val="Heading1"/>
-      </w:pPr>
-      <w:r>
-        <w:t>10. 后续工程路线</w:t>
+        <w:pStyle w:val="ListNumber"/>
+      </w:pPr>
+      <w:r>
+        <w:rPr>
+          <w:rFonts w:ascii="Microsoft YaHei" w:hAnsi="Microsoft YaHei" w:eastAsia="Microsoft YaHei"/>
+          <w:color w:val="1E2630"/>
+          <w:sz w:val="21"/>
+        </w:rPr>
+        <w:t>SyncCorrectionCoordinator：pending 命令、超时、错误 client/epoch、重复 ACK 和断开清理如何构成命令生命周期。</w:t>
       </w:r>
     </w:p>
     <w:p>
@@ -7808,7 +7808,7 @@
           <w:color w:val="1E2630"/>
           <w:sz w:val="21"/>
         </w:rPr>
-        <w:t>用两台真实电脑完成同媒体、相同公网 server 的验收，采集 correction_decision、correction_command、correction_execution 和 correction_result 全链路日志。</w:t>
+        <w:t>SyncCorrectionExecutor：为什么把播放器安全门从 Windows 会话层抽出，才能用 MockPlayer 做 Linux/Windows 同一套回归。</w:t>
       </w:r>
     </w:p>
     <w:p>
@@ -7821,7 +7821,7 @@
           <w:color w:val="1E2630"/>
           <w:sz w:val="21"/>
         </w:rPr>
-        <w:t>制造持续 750 ms 以上落后，验证只校正落后端、ACK 能匹配、5 秒冷却生效，并观察是否出现过冲或反复 seek。</w:t>
+        <w:t>CONTROL epoch：为什么本地操作也要等待 server 回显，以及 epoch gap 为什么应视为不可继续的协议错误。</w:t>
       </w:r>
     </w:p>
     <w:p>
@@ -7834,7 +7834,7 @@
           <w:color w:val="1E2630"/>
           <w:sz w:val="21"/>
         </w:rPr>
-        <w:t>统计校正前后 pair median/P95、命令成功率、拒绝原因和用户可见跳转频率，再决定是否调整阈值。</w:t>
+        <w:t>目标 client 级冷却：为什么多人房间不能只按 pair 冷却。</w:t>
       </w:r>
     </w:p>
     <w:p>
@@ -7847,7 +7847,7 @@
           <w:color w:val="1E2630"/>
           <w:sz w:val="21"/>
         </w:rPr>
-        <w:t>公网硬 seek 闭环稳定后，再研究 250-750 ms 小偏差的温和校正；暂不贸然引入倍速控制。</w:t>
+        <w:t>MetricLogger：当指标跨多个 cpp 产生时，为什么每个类各自一把日志锁仍然不够。</w:t>
       </w:r>
     </w:p>
     <w:p>
@@ -7860,7 +7860,7 @@
           <w:color w:val="1E2630"/>
           <w:sz w:val="21"/>
         </w:rPr>
-        <w:t>进一步同步 server/client 时钟并支持未来执行时间，让两端在约定时刻执行控制，降低广播到达差。</w:t>
+        <w:t>Linux SIGPIPE：为什么 send 的返回值检查仍可能来不及执行，以及进程退出码 141 如何形成。</w:t>
       </w:r>
     </w:p>
     <w:p>
@@ -7873,7 +7873,7 @@
           <w:color w:val="1E2630"/>
           <w:sz w:val="21"/>
         </w:rPr>
-        <w:t>在 Qt 客户端上继续增加房间信息、聊天与弹幕，但不让 UI 直接处理协议字符串。</w:t>
+        <w:t>晚加入稳定窗口：为什么 SNAPSHOT 已经包含当前进度，libVLC 仍可能短暂上报 0 ms 或留下 421-537 ms 偏差。</w:t>
       </w:r>
     </w:p>
     <w:p>
@@ -7886,31 +7886,171 @@
           <w:color w:val="1E2630"/>
           <w:sz w:val="21"/>
         </w:rPr>
-        <w:t>补齐 systemd 服务、配置文件、日志轮转、自动构建测试和发布包。</w:t>
+        <w:t>故障注入下的 RTT：为什么暂停整个进程会同时阻塞 PONG，累计平均值为何不适合作为实时网络基线。</w:t>
       </w:r>
     </w:p>
     <w:p>
       <w:pPr>
-        <w:spacing w:before="120" w:after="160" w:line="300" w:lineRule="auto"/>
-        <w:shd w:fill="F4F6F9"/>
-        <w:ind w:left="160" w:right="160"/>
+        <w:pStyle w:val="ListNumber"/>
       </w:pPr>
       <w:r>
         <w:rPr>
           <w:rFonts w:ascii="Microsoft YaHei" w:hAnsi="Microsoft YaHei" w:eastAsia="Microsoft YaHei"/>
-          <w:b/>
-          <w:color w:val="1F4D78"/>
+          <w:color w:val="1E2630"/>
           <w:sz w:val="21"/>
         </w:rPr>
-        <w:t>下一阶段入口：</w:t>
-      </w:r>
+        <w:t>metrics 会话生命周期：为什么 Room 清空时业务 epoch 和统计 epoch 必须一起重置。</w:t>
+      </w:r>
+    </w:p>
+    <w:p>
+      <w:pPr>
+        <w:pStyle w:val="ListNumber"/>
+      </w:pPr>
       <w:r>
         <w:rPr>
           <w:rFonts w:ascii="Microsoft YaHei" w:hAnsi="Microsoft YaHei" w:eastAsia="Microsoft YaHei"/>
           <w:color w:val="1E2630"/>
           <w:sz w:val="21"/>
         </w:rPr>
-        <w:t>最小自动校正已完成可靠性收口和第二轮云端单机双实例验收：Linux SIGPIPE、metrics 会话重置、滚动 RTT 基线和晚加入位置确认均已实现并通过回归。两次故障注入分别从约 22.1 秒和 8.1 秒偏差恢复，最终 Playing 窗口中位偏差约 88 ms。下一步用两台真实电脑复测相同场景，再根据跨设备数据决定是否为 250-750 ms 中等偏差引入温和校正。</w:t>
+        <w:t>TelemetryEvent 与 schema_version：为什么先稳定事件契约，再选择 Prometheus、Loki 或数据库。</w:t>
+      </w:r>
+    </w:p>
+    <w:p>
+      <w:pPr>
+        <w:pStyle w:val="ListNumber"/>
+      </w:pPr>
+      <w:r>
+        <w:rPr>
+          <w:rFonts w:ascii="Microsoft YaHei" w:hAnsi="Microsoft YaHei" w:eastAsia="Microsoft YaHei"/>
+          <w:color w:val="1E2630"/>
+          <w:sz w:val="21"/>
+        </w:rPr>
+        <w:t>session_id 生命周期：为什么 client_id 不能跨会话关联，媒体原始 URL 也不应进入遥测。</w:t>
+      </w:r>
+    </w:p>
+    <w:p>
+      <w:pPr>
+        <w:pStyle w:val="ListNumber"/>
+      </w:pPr>
+      <w:r>
+        <w:rPr>
+          <w:rFonts w:ascii="Microsoft YaHei" w:hAnsi="Microsoft YaHei" w:eastAsia="Microsoft YaHei"/>
+          <w:color w:val="1E2630"/>
+          <w:sz w:val="21"/>
+        </w:rPr>
+        <w:t>指标口径：如何定义成功率分子分母、有效样本、settling 排除条件与 P50/P95/P99。</w:t>
+      </w:r>
+    </w:p>
+    <w:p>
+      <w:pPr>
+        <w:pStyle w:val="ListNumber"/>
+      </w:pPr>
+      <w:r>
+        <w:rPr>
+          <w:rFonts w:ascii="Microsoft YaHei" w:hAnsi="Microsoft YaHei" w:eastAsia="Microsoft YaHei"/>
+          <w:color w:val="1E2630"/>
+          <w:sz w:val="21"/>
+        </w:rPr>
+        <w:t>低基数维度：为什么错误全文、session_id 和 media_id 可以用于日志检索，却不能直接做 Prometheus label。</w:t>
+      </w:r>
+    </w:p>
+    <w:p>
+      <w:pPr>
+        <w:pStyle w:val="ListNumber"/>
+      </w:pPr>
+      <w:r>
+        <w:rPr>
+          <w:rFonts w:ascii="Microsoft YaHei" w:hAnsi="Microsoft YaHei" w:eastAsia="Microsoft YaHei"/>
+          <w:color w:val="1E2630"/>
+          <w:sz w:val="21"/>
+        </w:rPr>
+        <w:t>RED 与 USE：如何分别衡量服务请求和 CPU、内存、文件描述符、网络等资源饱和度。</w:t>
+      </w:r>
+    </w:p>
+    <w:p>
+      <w:pPr>
+        <w:pStyle w:val="Heading1"/>
+      </w:pPr>
+      <w:r>
+        <w:t>10. 后续工程路线</w:t>
+      </w:r>
+    </w:p>
+    <w:p>
+      <w:pPr>
+        <w:pStyle w:val="ListNumber"/>
+      </w:pPr>
+      <w:r>
+        <w:rPr>
+          <w:rFonts w:ascii="Microsoft YaHei" w:hAnsi="Microsoft YaHei" w:eastAsia="Microsoft YaHei"/>
+          <w:color w:val="1E2630"/>
+          <w:sz w:val="21"/>
+        </w:rPr>
+        <w:t>实现首帧、初始同步、控制应用 ACK、校正收敛和会话汇总事件，形成八项核心体验指标。</w:t>
+      </w:r>
+    </w:p>
+    <w:p>
+      <w:pPr>
+        <w:pStyle w:val="ListNumber"/>
+      </w:pPr>
+      <w:r>
+        <w:rPr>
+          <w:rFonts w:ascii="Microsoft YaHei" w:hAnsi="Microsoft YaHei" w:eastAsia="Microsoft YaHei"/>
+          <w:color w:val="1E2630"/>
+          <w:sz w:val="21"/>
+        </w:rPr>
+        <w:t>为 JSONL 增加日志轮转与保留策略，并从事件生成离线会话报告，先验证成功率和分位数口径。</w:t>
+      </w:r>
+    </w:p>
+    <w:p>
+      <w:pPr>
+        <w:pStyle w:val="ListNumber"/>
+      </w:pPr>
+      <w:r>
+        <w:rPr>
+          <w:rFonts w:ascii="Microsoft YaHei" w:hAnsi="Microsoft YaHei" w:eastAsia="Microsoft YaHei"/>
+          <w:color w:val="1E2630"/>
+          <w:sz w:val="21"/>
+        </w:rPr>
+        <w:t>接入 Prometheus counter/gauge/histogram 与 /metrics endpoint，严格限制 label 基数。</w:t>
+      </w:r>
+    </w:p>
+    <w:p>
+      <w:pPr>
+        <w:pStyle w:val="ListNumber"/>
+      </w:pPr>
+      <w:r>
+        <w:rPr>
+          <w:rFonts w:ascii="Microsoft YaHei" w:hAnsi="Microsoft YaHei" w:eastAsia="Microsoft YaHei"/>
+          <w:color w:val="1E2630"/>
+          <w:sz w:val="21"/>
+        </w:rPr>
+        <w:t>建立用户体验、同步质量、系统资源三张 Grafana 看板，并为持续超标而非单点异常配置告警。</w:t>
+      </w:r>
+    </w:p>
+    <w:p>
+      <w:pPr>
+        <w:pStyle w:val="ListNumber"/>
+      </w:pPr>
+      <w:r>
+        <w:rPr>
+          <w:rFonts w:ascii="Microsoft YaHei" w:hAnsi="Microsoft YaHei" w:eastAsia="Microsoft YaHei"/>
+          <w:color w:val="1E2630"/>
+          <w:sz w:val="21"/>
+        </w:rPr>
+        <w:t>用两台真实电脑和延迟、抖动、丢包、进程暂停、断网、server 重启实验验证 SLO。</w:t>
+      </w:r>
+    </w:p>
+    <w:p>
+      <w:pPr>
+        <w:pStyle w:val="ListNumber"/>
+      </w:pPr>
+      <w:r>
+        <w:rPr>
+          <w:rFonts w:ascii="Microsoft YaHei" w:hAnsi="Microsoft YaHei" w:eastAsia="Microsoft YaHei"/>
+          <w:color w:val="1E2630"/>
+          <w:sz w:val="21"/>
+        </w:rPr>
+        <w:t>补齐服务托管、健康检查、优雅停机、自动重连、CI 和发布包；随后增加聊天与弹幕。</w:t>
       </w:r>
     </w:p>
     <w:sectPr>

</xml_diff>

<commit_message>
observability: automate fault experiments and reporting
</commit_message>
<xml_diff>
--- a/docs/SyncCinema_Engineering_Journal.docx
+++ b/docs/SyncCinema_Engineering_Journal.docx
@@ -206,7 +206,7 @@
                 <w:color w:val="1E2630"/>
                 <w:sz w:val="19"/>
               </w:rPr>
-              <w:t>b960333 + 同步校正可靠性收口</w:t>
+              <w:t>291c09c + 可观测性展示告警</w:t>
             </w:r>
           </w:p>
         </w:tc>
@@ -247,7 +247,7 @@
                 <w:color w:val="1E2630"/>
                 <w:sz w:val="19"/>
               </w:rPr>
-              <w:t>可观测性指标契约与结构化会话事件</w:t>
+              <w:t>产品可观测性闭环与可复现实验</w:t>
             </w:r>
           </w:p>
         </w:tc>
@@ -1313,6 +1313,537 @@
           </w:p>
         </w:tc>
       </w:tr>
+      <w:tr>
+        <w:tc>
+          <w:tcPr>
+            <w:tcW w:type="dxa" w:w="1450"/>
+          </w:tcPr>
+          <w:p>
+            <w:pPr>
+              <w:spacing w:before="0" w:after="0" w:line="276" w:lineRule="auto"/>
+              <w:jc w:val="center"/>
+            </w:pPr>
+            <w:r>
+              <w:rPr>
+                <w:rFonts w:ascii="Consolas" w:hAnsi="Consolas" w:eastAsia="Consolas"/>
+                <w:color w:val="1E2630"/>
+                <w:sz w:val="17"/>
+              </w:rPr>
+              <w:t>81ec949</w:t>
+            </w:r>
+          </w:p>
+        </w:tc>
+        <w:tc>
+          <w:tcPr>
+            <w:tcW w:type="dxa" w:w="3300"/>
+          </w:tcPr>
+          <w:p>
+            <w:pPr>
+              <w:spacing w:before="0" w:after="0" w:line="276" w:lineRule="auto"/>
+              <w:jc w:val="left"/>
+            </w:pPr>
+            <w:r>
+              <w:rPr>
+                <w:rFonts w:ascii="Microsoft YaHei" w:hAnsi="Microsoft YaHei" w:eastAsia="Microsoft YaHei"/>
+                <w:color w:val="1E2630"/>
+                <w:sz w:val="18"/>
+              </w:rPr>
+              <w:t>Qt desktop client</w:t>
+            </w:r>
+          </w:p>
+        </w:tc>
+        <w:tc>
+          <w:tcPr>
+            <w:tcW w:type="dxa" w:w="4610"/>
+          </w:tcPr>
+          <w:p>
+            <w:pPr>
+              <w:spacing w:before="0" w:after="0" w:line="276" w:lineRule="auto"/>
+              <w:jc w:val="left"/>
+            </w:pPr>
+            <w:r>
+              <w:rPr>
+                <w:rFonts w:ascii="Microsoft YaHei" w:hAnsi="Microsoft YaHei" w:eastAsia="Microsoft YaHei"/>
+                <w:color w:val="1E2630"/>
+                <w:sz w:val="18"/>
+              </w:rPr>
+              <w:t>共享会话层支撑可直接使用的 Windows 播放器界面</w:t>
+            </w:r>
+          </w:p>
+        </w:tc>
+      </w:tr>
+      <w:tr>
+        <w:tc>
+          <w:tcPr>
+            <w:tcW w:type="dxa" w:w="1450"/>
+          </w:tcPr>
+          <w:p>
+            <w:pPr>
+              <w:spacing w:before="0" w:after="0" w:line="276" w:lineRule="auto"/>
+              <w:jc w:val="center"/>
+            </w:pPr>
+            <w:r>
+              <w:rPr>
+                <w:rFonts w:ascii="Consolas" w:hAnsi="Consolas" w:eastAsia="Consolas"/>
+                <w:color w:val="1E2630"/>
+                <w:sz w:val="17"/>
+              </w:rPr>
+              <w:t>10a19af</w:t>
+            </w:r>
+          </w:p>
+        </w:tc>
+        <w:tc>
+          <w:tcPr>
+            <w:tcW w:type="dxa" w:w="3300"/>
+          </w:tcPr>
+          <w:p>
+            <w:pPr>
+              <w:spacing w:before="0" w:after="0" w:line="276" w:lineRule="auto"/>
+              <w:jc w:val="left"/>
+            </w:pPr>
+            <w:r>
+              <w:rPr>
+                <w:rFonts w:ascii="Microsoft YaHei" w:hAnsi="Microsoft YaHei" w:eastAsia="Microsoft YaHei"/>
+                <w:color w:val="1E2630"/>
+                <w:sz w:val="18"/>
+              </w:rPr>
+              <w:t>media session identity</w:t>
+            </w:r>
+          </w:p>
+        </w:tc>
+        <w:tc>
+          <w:tcPr>
+            <w:tcW w:type="dxa" w:w="4610"/>
+          </w:tcPr>
+          <w:p>
+            <w:pPr>
+              <w:spacing w:before="0" w:after="0" w:line="276" w:lineRule="auto"/>
+              <w:jc w:val="left"/>
+            </w:pPr>
+            <w:r>
+              <w:rPr>
+                <w:rFonts w:ascii="Microsoft YaHei" w:hAnsi="Microsoft YaHei" w:eastAsia="Microsoft YaHei"/>
+                <w:color w:val="1E2630"/>
+                <w:sz w:val="18"/>
+              </w:rPr>
+              <w:t>隔离不同媒体的 Room 状态并拒绝错误会话加入</w:t>
+            </w:r>
+          </w:p>
+        </w:tc>
+      </w:tr>
+      <w:tr>
+        <w:tc>
+          <w:tcPr>
+            <w:tcW w:type="dxa" w:w="1450"/>
+          </w:tcPr>
+          <w:p>
+            <w:pPr>
+              <w:spacing w:before="0" w:after="0" w:line="276" w:lineRule="auto"/>
+              <w:jc w:val="center"/>
+            </w:pPr>
+            <w:r>
+              <w:rPr>
+                <w:rFonts w:ascii="Consolas" w:hAnsi="Consolas" w:eastAsia="Consolas"/>
+                <w:color w:val="1E2630"/>
+                <w:sz w:val="17"/>
+              </w:rPr>
+              <w:t>12dff62</w:t>
+            </w:r>
+          </w:p>
+        </w:tc>
+        <w:tc>
+          <w:tcPr>
+            <w:tcW w:type="dxa" w:w="3300"/>
+          </w:tcPr>
+          <w:p>
+            <w:pPr>
+              <w:spacing w:before="0" w:after="0" w:line="276" w:lineRule="auto"/>
+              <w:jc w:val="left"/>
+            </w:pPr>
+            <w:r>
+              <w:rPr>
+                <w:rFonts w:ascii="Microsoft YaHei" w:hAnsi="Microsoft YaHei" w:eastAsia="Microsoft YaHei"/>
+                <w:color w:val="1E2630"/>
+                <w:sz w:val="18"/>
+              </w:rPr>
+              <w:t>media playback feedback</w:t>
+            </w:r>
+          </w:p>
+        </w:tc>
+        <w:tc>
+          <w:tcPr>
+            <w:tcW w:type="dxa" w:w="4610"/>
+          </w:tcPr>
+          <w:p>
+            <w:pPr>
+              <w:spacing w:before="0" w:after="0" w:line="276" w:lineRule="auto"/>
+              <w:jc w:val="left"/>
+            </w:pPr>
+            <w:r>
+              <w:rPr>
+                <w:rFonts w:ascii="Microsoft YaHei" w:hAnsi="Microsoft YaHei" w:eastAsia="Microsoft YaHei"/>
+                <w:color w:val="1E2630"/>
+                <w:sz w:val="18"/>
+              </w:rPr>
+              <w:t>把 libVLC 异步打开、缓冲和失败反馈到 UI</w:t>
+            </w:r>
+          </w:p>
+        </w:tc>
+      </w:tr>
+      <w:tr>
+        <w:tc>
+          <w:tcPr>
+            <w:tcW w:type="dxa" w:w="1450"/>
+          </w:tcPr>
+          <w:p>
+            <w:pPr>
+              <w:spacing w:before="0" w:after="0" w:line="276" w:lineRule="auto"/>
+              <w:jc w:val="center"/>
+            </w:pPr>
+            <w:r>
+              <w:rPr>
+                <w:rFonts w:ascii="Consolas" w:hAnsi="Consolas" w:eastAsia="Consolas"/>
+                <w:color w:val="1E2630"/>
+                <w:sz w:val="17"/>
+              </w:rPr>
+              <w:t>c89e021</w:t>
+            </w:r>
+          </w:p>
+        </w:tc>
+        <w:tc>
+          <w:tcPr>
+            <w:tcW w:type="dxa" w:w="3300"/>
+          </w:tcPr>
+          <w:p>
+            <w:pPr>
+              <w:spacing w:before="0" w:after="0" w:line="276" w:lineRule="auto"/>
+              <w:jc w:val="left"/>
+            </w:pPr>
+            <w:r>
+              <w:rPr>
+                <w:rFonts w:ascii="Microsoft YaHei" w:hAnsi="Microsoft YaHei" w:eastAsia="Microsoft YaHei"/>
+                <w:color w:val="1E2630"/>
+                <w:sz w:val="18"/>
+              </w:rPr>
+              <w:t>guarded correction execution</w:t>
+            </w:r>
+          </w:p>
+        </w:tc>
+        <w:tc>
+          <w:tcPr>
+            <w:tcW w:type="dxa" w:w="4610"/>
+          </w:tcPr>
+          <w:p>
+            <w:pPr>
+              <w:spacing w:before="0" w:after="0" w:line="276" w:lineRule="auto"/>
+              <w:jc w:val="left"/>
+            </w:pPr>
+            <w:r>
+              <w:rPr>
+                <w:rFonts w:ascii="Microsoft YaHei" w:hAnsi="Microsoft YaHei" w:eastAsia="Microsoft YaHei"/>
+                <w:color w:val="1E2630"/>
+                <w:sz w:val="18"/>
+              </w:rPr>
+              <w:t>server 到目标 client 的校正命令、ACK 与安全执行闭环</w:t>
+            </w:r>
+          </w:p>
+        </w:tc>
+      </w:tr>
+      <w:tr>
+        <w:tc>
+          <w:tcPr>
+            <w:tcW w:type="dxa" w:w="1450"/>
+          </w:tcPr>
+          <w:p>
+            <w:pPr>
+              <w:spacing w:before="0" w:after="0" w:line="276" w:lineRule="auto"/>
+              <w:jc w:val="center"/>
+            </w:pPr>
+            <w:r>
+              <w:rPr>
+                <w:rFonts w:ascii="Consolas" w:hAnsi="Consolas" w:eastAsia="Consolas"/>
+                <w:color w:val="1E2630"/>
+                <w:sz w:val="17"/>
+              </w:rPr>
+              <w:t>b960333</w:t>
+            </w:r>
+          </w:p>
+        </w:tc>
+        <w:tc>
+          <w:tcPr>
+            <w:tcW w:type="dxa" w:w="3300"/>
+          </w:tcPr>
+          <w:p>
+            <w:pPr>
+              <w:spacing w:before="0" w:after="0" w:line="276" w:lineRule="auto"/>
+              <w:jc w:val="left"/>
+            </w:pPr>
+            <w:r>
+              <w:rPr>
+                <w:rFonts w:ascii="Microsoft YaHei" w:hAnsi="Microsoft YaHei" w:eastAsia="Microsoft YaHei"/>
+                <w:color w:val="1E2630"/>
+                <w:sz w:val="18"/>
+              </w:rPr>
+              <w:t>sync recovery hardening</w:t>
+            </w:r>
+          </w:p>
+        </w:tc>
+        <w:tc>
+          <w:tcPr>
+            <w:tcW w:type="dxa" w:w="4610"/>
+          </w:tcPr>
+          <w:p>
+            <w:pPr>
+              <w:spacing w:before="0" w:after="0" w:line="276" w:lineRule="auto"/>
+              <w:jc w:val="left"/>
+            </w:pPr>
+            <w:r>
+              <w:rPr>
+                <w:rFonts w:ascii="Microsoft YaHei" w:hAnsi="Microsoft YaHei" w:eastAsia="Microsoft YaHei"/>
+                <w:color w:val="1E2630"/>
+                <w:sz w:val="18"/>
+              </w:rPr>
+              <w:t>修复 SIGPIPE、晚加入恢复和统计会话残留</w:t>
+            </w:r>
+          </w:p>
+        </w:tc>
+      </w:tr>
+      <w:tr>
+        <w:tc>
+          <w:tcPr>
+            <w:tcW w:type="dxa" w:w="1450"/>
+          </w:tcPr>
+          <w:p>
+            <w:pPr>
+              <w:spacing w:before="0" w:after="0" w:line="276" w:lineRule="auto"/>
+              <w:jc w:val="center"/>
+            </w:pPr>
+            <w:r>
+              <w:rPr>
+                <w:rFonts w:ascii="Consolas" w:hAnsi="Consolas" w:eastAsia="Consolas"/>
+                <w:color w:val="1E2630"/>
+                <w:sz w:val="17"/>
+              </w:rPr>
+              <w:t>18ed947</w:t>
+            </w:r>
+          </w:p>
+        </w:tc>
+        <w:tc>
+          <w:tcPr>
+            <w:tcW w:type="dxa" w:w="3300"/>
+          </w:tcPr>
+          <w:p>
+            <w:pPr>
+              <w:spacing w:before="0" w:after="0" w:line="276" w:lineRule="auto"/>
+              <w:jc w:val="left"/>
+            </w:pPr>
+            <w:r>
+              <w:rPr>
+                <w:rFonts w:ascii="Microsoft YaHei" w:hAnsi="Microsoft YaHei" w:eastAsia="Microsoft YaHei"/>
+                <w:color w:val="1E2630"/>
+                <w:sz w:val="18"/>
+              </w:rPr>
+              <w:t>structured session telemetry</w:t>
+            </w:r>
+          </w:p>
+        </w:tc>
+        <w:tc>
+          <w:tcPr>
+            <w:tcW w:type="dxa" w:w="4610"/>
+          </w:tcPr>
+          <w:p>
+            <w:pPr>
+              <w:spacing w:before="0" w:after="0" w:line="276" w:lineRule="auto"/>
+              <w:jc w:val="left"/>
+            </w:pPr>
+            <w:r>
+              <w:rPr>
+                <w:rFonts w:ascii="Microsoft YaHei" w:hAnsi="Microsoft YaHei" w:eastAsia="Microsoft YaHei"/>
+                <w:color w:val="1E2630"/>
+                <w:sz w:val="18"/>
+              </w:rPr>
+              <w:t>版本化 JSONL、session_id 和生命周期事件</w:t>
+            </w:r>
+          </w:p>
+        </w:tc>
+      </w:tr>
+      <w:tr>
+        <w:tc>
+          <w:tcPr>
+            <w:tcW w:type="dxa" w:w="1450"/>
+          </w:tcPr>
+          <w:p>
+            <w:pPr>
+              <w:spacing w:before="0" w:after="0" w:line="276" w:lineRule="auto"/>
+              <w:jc w:val="center"/>
+            </w:pPr>
+            <w:r>
+              <w:rPr>
+                <w:rFonts w:ascii="Consolas" w:hAnsi="Consolas" w:eastAsia="Consolas"/>
+                <w:color w:val="1E2630"/>
+                <w:sz w:val="17"/>
+              </w:rPr>
+              <w:t>1632195</w:t>
+            </w:r>
+          </w:p>
+        </w:tc>
+        <w:tc>
+          <w:tcPr>
+            <w:tcW w:type="dxa" w:w="3300"/>
+          </w:tcPr>
+          <w:p>
+            <w:pPr>
+              <w:spacing w:before="0" w:after="0" w:line="276" w:lineRule="auto"/>
+              <w:jc w:val="left"/>
+            </w:pPr>
+            <w:r>
+              <w:rPr>
+                <w:rFonts w:ascii="Microsoft YaHei" w:hAnsi="Microsoft YaHei" w:eastAsia="Microsoft YaHei"/>
+                <w:color w:val="1E2630"/>
+                <w:sz w:val="18"/>
+              </w:rPr>
+              <w:t>playback experience outcomes</w:t>
+            </w:r>
+          </w:p>
+        </w:tc>
+        <w:tc>
+          <w:tcPr>
+            <w:tcW w:type="dxa" w:w="4610"/>
+          </w:tcPr>
+          <w:p>
+            <w:pPr>
+              <w:spacing w:before="0" w:after="0" w:line="276" w:lineRule="auto"/>
+              <w:jc w:val="left"/>
+            </w:pPr>
+            <w:r>
+              <w:rPr>
+                <w:rFonts w:ascii="Microsoft YaHei" w:hAnsi="Microsoft YaHei" w:eastAsia="Microsoft YaHei"/>
+                <w:color w:val="1E2630"/>
+                <w:sz w:val="18"/>
+              </w:rPr>
+              <w:t>首帧、控制 ACK、同步质量、校正收敛和会话汇总</w:t>
+            </w:r>
+          </w:p>
+        </w:tc>
+      </w:tr>
+      <w:tr>
+        <w:tc>
+          <w:tcPr>
+            <w:tcW w:type="dxa" w:w="1450"/>
+          </w:tcPr>
+          <w:p>
+            <w:pPr>
+              <w:spacing w:before="0" w:after="0" w:line="276" w:lineRule="auto"/>
+              <w:jc w:val="center"/>
+            </w:pPr>
+            <w:r>
+              <w:rPr>
+                <w:rFonts w:ascii="Consolas" w:hAnsi="Consolas" w:eastAsia="Consolas"/>
+                <w:color w:val="1E2630"/>
+                <w:sz w:val="17"/>
+              </w:rPr>
+              <w:t>613381c</w:t>
+            </w:r>
+          </w:p>
+        </w:tc>
+        <w:tc>
+          <w:tcPr>
+            <w:tcW w:type="dxa" w:w="3300"/>
+          </w:tcPr>
+          <w:p>
+            <w:pPr>
+              <w:spacing w:before="0" w:after="0" w:line="276" w:lineRule="auto"/>
+              <w:jc w:val="left"/>
+            </w:pPr>
+            <w:r>
+              <w:rPr>
+                <w:rFonts w:ascii="Microsoft YaHei" w:hAnsi="Microsoft YaHei" w:eastAsia="Microsoft YaHei"/>
+                <w:color w:val="1E2630"/>
+                <w:sz w:val="18"/>
+              </w:rPr>
+              <w:t>bounded Prometheus metrics</w:t>
+            </w:r>
+          </w:p>
+        </w:tc>
+        <w:tc>
+          <w:tcPr>
+            <w:tcW w:type="dxa" w:w="4610"/>
+          </w:tcPr>
+          <w:p>
+            <w:pPr>
+              <w:spacing w:before="0" w:after="0" w:line="276" w:lineRule="auto"/>
+              <w:jc w:val="left"/>
+            </w:pPr>
+            <w:r>
+              <w:rPr>
+                <w:rFonts w:ascii="Microsoft YaHei" w:hAnsi="Microsoft YaHei" w:eastAsia="Microsoft YaHei"/>
+                <w:color w:val="1E2630"/>
+                <w:sz w:val="18"/>
+              </w:rPr>
+              <w:t>低基数在线指标与回环地址健康检查端点</w:t>
+            </w:r>
+          </w:p>
+        </w:tc>
+      </w:tr>
+      <w:tr>
+        <w:tc>
+          <w:tcPr>
+            <w:tcW w:type="dxa" w:w="1450"/>
+          </w:tcPr>
+          <w:p>
+            <w:pPr>
+              <w:spacing w:before="0" w:after="0" w:line="276" w:lineRule="auto"/>
+              <w:jc w:val="center"/>
+            </w:pPr>
+            <w:r>
+              <w:rPr>
+                <w:rFonts w:ascii="Consolas" w:hAnsi="Consolas" w:eastAsia="Consolas"/>
+                <w:color w:val="1E2630"/>
+                <w:sz w:val="17"/>
+              </w:rPr>
+              <w:t>291c09c</w:t>
+            </w:r>
+          </w:p>
+        </w:tc>
+        <w:tc>
+          <w:tcPr>
+            <w:tcW w:type="dxa" w:w="3300"/>
+          </w:tcPr>
+          <w:p>
+            <w:pPr>
+              <w:spacing w:before="0" w:after="0" w:line="276" w:lineRule="auto"/>
+              <w:jc w:val="left"/>
+            </w:pPr>
+            <w:r>
+              <w:rPr>
+                <w:rFonts w:ascii="Microsoft YaHei" w:hAnsi="Microsoft YaHei" w:eastAsia="Microsoft YaHei"/>
+                <w:color w:val="1E2630"/>
+                <w:sz w:val="18"/>
+              </w:rPr>
+              <w:t>dashboards and alerts</w:t>
+            </w:r>
+          </w:p>
+        </w:tc>
+        <w:tc>
+          <w:tcPr>
+            <w:tcW w:type="dxa" w:w="4610"/>
+          </w:tcPr>
+          <w:p>
+            <w:pPr>
+              <w:spacing w:before="0" w:after="0" w:line="276" w:lineRule="auto"/>
+              <w:jc w:val="left"/>
+            </w:pPr>
+            <w:r>
+              <w:rPr>
+                <w:rFonts w:ascii="Microsoft YaHei" w:hAnsi="Microsoft YaHei" w:eastAsia="Microsoft YaHei"/>
+                <w:color w:val="1E2630"/>
+                <w:sz w:val="18"/>
+              </w:rPr>
+              <w:t>自动配置 Grafana 总览与带样本门槛的告警规则</w:t>
+            </w:r>
+          </w:p>
+        </w:tc>
+      </w:tr>
     </w:tbl>
     <w:p>
       <w:pPr>
@@ -7342,6 +7873,311 @@
     </w:p>
     <w:p>
       <w:pPr>
+        <w:pStyle w:val="Heading2"/>
+      </w:pPr>
+      <w:r>
+        <w:t>7.16 可观测性第二阶段：核心体验结果</w:t>
+      </w:r>
+    </w:p>
+    <w:p>
+      <w:pPr>
+        <w:spacing w:before="0" w:after="120" w:line="300" w:lineRule="auto"/>
+      </w:pPr>
+      <w:r>
+        <w:rPr>
+          <w:rFonts w:ascii="Microsoft YaHei" w:hAnsi="Microsoft YaHei" w:eastAsia="Microsoft YaHei"/>
+          <w:color w:val="1E2630"/>
+          <w:sz w:val="21"/>
+        </w:rPr>
+        <w:t>提交 1632195 把指标契约落实为可计算事实。client 在 libVLC 真正进入 Playing 后发送 FIRST_FRAME，并为每个权威 PLAY、PAUSE、SEEK 返回 CONTROL_RESULT；server 只使用自己的 steady_clock 计算从广播到匹配 ACK 的耗时，避免比较不同设备的系统时间。ExperienceMetricsCollector 独立维护待确认命令、首帧、有效 pair 样本和待收敛校正，不承担 socket 与日志职责。</w:t>
+      </w:r>
+    </w:p>
+    <w:p>
+      <w:pPr>
+        <w:pStyle w:val="ListBullet"/>
+      </w:pPr>
+      <w:r>
+        <w:rPr>
+          <w:rFonts w:ascii="Microsoft YaHei" w:hAnsi="Microsoft YaHei" w:eastAsia="Microsoft YaHei"/>
+          <w:color w:val="1E2630"/>
+          <w:sz w:val="21"/>
+        </w:rPr>
+        <w:t>首帧：按 JOIN、PLAY 和 SEEK 的触发原因记录从用户相关动作到 libVLC Playing 事件的耗时，并识别重复、未知 client 和无效消息。</w:t>
+      </w:r>
+    </w:p>
+    <w:p>
+      <w:pPr>
+        <w:pStyle w:val="ListBullet"/>
+      </w:pPr>
+      <w:r>
+        <w:rPr>
+          <w:rFonts w:ascii="Microsoft YaHei" w:hAnsi="Microsoft YaHei" w:eastAsia="Microsoft YaHei"/>
+          <w:color w:val="1E2630"/>
+          <w:sz w:val="21"/>
+        </w:rPr>
+        <w:t>控制 ACK：server 记录目标 client 集合；client 报告 APPLIED 或 REJECTED、播放器 API 执行耗时和实际位置；会话结束时仍未返回的目标计为 missing。</w:t>
+      </w:r>
+    </w:p>
+    <w:p>
+      <w:pPr>
+        <w:pStyle w:val="ListBullet"/>
+      </w:pPr>
+      <w:r>
+        <w:rPr>
+          <w:rFonts w:ascii="Microsoft YaHei" w:hAnsi="Microsoft YaHei" w:eastAsia="Microsoft YaHei"/>
+          <w:color w:val="1E2630"/>
+          <w:sz w:val="21"/>
+        </w:rPr>
+        <w:t>同步和校正：只统计通过 epoch、状态、样本新鲜度、RTT 与 settling 检查的 pair 样本；校正必须收到匹配 APPLIED，随后连续两次进入 250 ms 容差才算 converged。</w:t>
+      </w:r>
+    </w:p>
+    <w:p>
+      <w:pPr>
+        <w:pStyle w:val="ListBullet"/>
+      </w:pPr>
+      <w:r>
+        <w:rPr>
+          <w:rFonts w:ascii="Microsoft YaHei" w:hAnsi="Microsoft YaHei" w:eastAsia="Microsoft YaHei"/>
+          <w:color w:val="1E2630"/>
+          <w:sz w:val="21"/>
+        </w:rPr>
+        <w:t>会话汇总：最后一个 client 离开时输出 session_summary，包含首帧 P95 桶、控制 ACK P95 桶、sync good ratio、pair skew P95、校正成功与收敛统计。汇总使用固定桶，内存不会随播放时长增长。</w:t>
+      </w:r>
+    </w:p>
+    <w:p>
+      <w:pPr>
+        <w:spacing w:before="0" w:after="120" w:line="300" w:lineRule="auto"/>
+      </w:pPr>
+      <w:r>
+        <w:rPr>
+          <w:rFonts w:ascii="Microsoft YaHei" w:hAnsi="Microsoft YaHei" w:eastAsia="Microsoft YaHei"/>
+          <w:color w:val="1E2630"/>
+          <w:sz w:val="21"/>
+        </w:rPr>
+        <w:t>验证覆盖重复首帧、错误 epoch、重复 ACK、缺失 ACK、校正成功/失败/超时和连续良好样本。该阶段解决了‘日志很多但无法回答一次会话体验是否成功’的问题，也明确了桶上界是近似分位数，不应伪装成原始精确值。</w:t>
+      </w:r>
+    </w:p>
+    <w:p>
+      <w:pPr>
+        <w:pStyle w:val="Heading2"/>
+      </w:pPr>
+      <w:r>
+        <w:t>7.17 可观测性第三阶段：低基数在线指标</w:t>
+      </w:r>
+    </w:p>
+    <w:p>
+      <w:pPr>
+        <w:spacing w:before="0" w:after="120" w:line="300" w:lineRule="auto"/>
+      </w:pPr>
+      <w:r>
+        <w:rPr>
+          <w:rFonts w:ascii="Microsoft YaHei" w:hAnsi="Microsoft YaHei" w:eastAsia="Microsoft YaHei"/>
+          <w:color w:val="1E2630"/>
+          <w:sz w:val="21"/>
+        </w:rPr>
+        <w:t>提交 613381c 新增 PrometheusMetrics 和 MetricsHttpServer。server 默认只在 127.0.0.1:9100 暴露 /healthz 与 /metrics，端口可由 SYNCCINEMA_METRICS_PORT 覆盖；监控端点失败会被明确记录，但不会阻止9000 业务端口启动。</w:t>
+      </w:r>
+    </w:p>
+    <w:p>
+      <w:pPr>
+        <w:pStyle w:val="ListBullet"/>
+      </w:pPr>
+      <w:r>
+        <w:rPr>
+          <w:rFonts w:ascii="Microsoft YaHei" w:hAnsi="Microsoft YaHei" w:eastAsia="Microsoft YaHei"/>
+          <w:color w:val="1E2630"/>
+          <w:sz w:val="21"/>
+        </w:rPr>
+        <w:t>指标类型：当前连接数和活跃会话使用 gauge，JOIN/控制/校正生命周期使用 counter，首帧、ACK、pair skew和校正收敛使用 histogram。</w:t>
+      </w:r>
+    </w:p>
+    <w:p>
+      <w:pPr>
+        <w:pStyle w:val="ListBullet"/>
+      </w:pPr>
+      <w:r>
+        <w:rPr>
+          <w:rFonts w:ascii="Microsoft YaHei" w:hAnsi="Microsoft YaHei" w:eastAsia="Microsoft YaHei"/>
+          <w:color w:val="1E2630"/>
+          <w:sz w:val="21"/>
+        </w:rPr>
+        <w:t>基数控制：label 仅允许 outcome、reason、status、quality 和 command 等有限枚举；session_id、client_id、media_id、URL 与错误全文只留在 JSONL，不能制造无限时间序列。</w:t>
+      </w:r>
+    </w:p>
+    <w:p>
+      <w:pPr>
+        <w:pStyle w:val="ListBullet"/>
+      </w:pPr>
+      <w:r>
+        <w:rPr>
+          <w:rFonts w:ascii="Microsoft YaHei" w:hAnsi="Microsoft YaHei" w:eastAsia="Microsoft YaHei"/>
+          <w:color w:val="1E2630"/>
+          <w:sz w:val="21"/>
+        </w:rPr>
+        <w:t>并发与容量：固定数组保存枚举计数，直方图使用有限桶；渲染时持有内部 mutex 得到一致快照，采集内存与会话时长和用户数量中的高基数字段无关。</w:t>
+      </w:r>
+    </w:p>
+    <w:p>
+      <w:pPr>
+        <w:spacing w:before="0" w:after="120" w:line="300" w:lineRule="auto"/>
+      </w:pPr>
+      <w:r>
+        <w:rPr>
+          <w:rFonts w:ascii="Microsoft YaHei" w:hAnsi="Microsoft YaHei" w:eastAsia="Microsoft YaHei"/>
+          <w:color w:val="1E2630"/>
+          <w:sz w:val="21"/>
+        </w:rPr>
+        <w:t>测试不仅断言文本中存在指标，还真实启动回环 HTTP server，请求 healthz 和 metrics，验证状态码、Content-Length、Content-Type 与响应体。Windows 三目标构建、Linux server/CoreTests 和 CTest 均通过。</w:t>
+      </w:r>
+    </w:p>
+    <w:p>
+      <w:pPr>
+        <w:pStyle w:val="Heading2"/>
+      </w:pPr>
+      <w:r>
+        <w:t>7.18 可观测性第四阶段：看板与告警</w:t>
+      </w:r>
+    </w:p>
+    <w:p>
+      <w:pPr>
+        <w:spacing w:before="0" w:after="120" w:line="300" w:lineRule="auto"/>
+      </w:pPr>
+      <w:r>
+        <w:rPr>
+          <w:rFonts w:ascii="Microsoft YaHei" w:hAnsi="Microsoft YaHei" w:eastAsia="Microsoft YaHei"/>
+          <w:color w:val="1E2630"/>
+          <w:sz w:val="21"/>
+        </w:rPr>
+        <w:t>提交 291c09c 提供可直接部署的 Prometheus、Grafana、Alertmanager 和 node_exporter Compose 配置。所有 Web 管理端口只绑定服务器回环地址，开发机通过 SSH 隧道访问；镜像固定版本，Grafana 密码通过未提交的 .env 注入。这样避免把监控后台和默认口令暴露到公网。</w:t>
+      </w:r>
+    </w:p>
+    <w:p>
+      <w:pPr>
+        <w:pStyle w:val="ListBullet"/>
+      </w:pPr>
+      <w:r>
+        <w:rPr>
+          <w:rFonts w:ascii="Microsoft YaHei" w:hAnsi="Microsoft YaHei" w:eastAsia="Microsoft YaHei"/>
+          <w:color w:val="1E2630"/>
+          <w:sz w:val="21"/>
+        </w:rPr>
+        <w:t>Grafana 自动加载 14 个面板：服务状态、连接与会话、JOIN 成功率、首帧 P95、同步良好率、pair skew、控制 ACK、校正生命周期与收敛，以及主机 CPU、内存和磁盘。</w:t>
+      </w:r>
+    </w:p>
+    <w:p>
+      <w:pPr>
+        <w:pStyle w:val="ListBullet"/>
+      </w:pPr>
+      <w:r>
+        <w:rPr>
+          <w:rFonts w:ascii="Microsoft YaHei" w:hAnsi="Microsoft YaHei" w:eastAsia="Microsoft YaHei"/>
+          <w:color w:val="1E2630"/>
+          <w:sz w:val="21"/>
+        </w:rPr>
+        <w:t>Prometheus 配置 12 条规则。体验告警同时要求阈值超标、最小样本量和持续时间；没有足够数据时不把偶发点误报为产品故障。主机告警覆盖进程不可采集、磁盘和文件描述符压力。</w:t>
+      </w:r>
+    </w:p>
+    <w:p>
+      <w:pPr>
+        <w:pStyle w:val="ListBullet"/>
+      </w:pPr>
+      <w:r>
+        <w:rPr>
+          <w:rFonts w:ascii="Microsoft YaHei" w:hAnsi="Microsoft YaHei" w:eastAsia="Microsoft YaHei"/>
+          <w:color w:val="1E2630"/>
+          <w:sz w:val="21"/>
+        </w:rPr>
+        <w:t>Alertmanager 第一版只保存和展示告警，不把个人邮箱、Webhook 或密钥写进仓库。真实通知渠道属于部署私有配置，是已知上线项而不是代码中伪造的能力。</w:t>
+      </w:r>
+    </w:p>
+    <w:p>
+      <w:pPr>
+        <w:spacing w:before="0" w:after="120" w:line="300" w:lineRule="auto"/>
+      </w:pPr>
+      <w:r>
+        <w:rPr>
+          <w:rFonts w:ascii="Microsoft YaHei" w:hAnsi="Microsoft YaHei" w:eastAsia="Microsoft YaHei"/>
+          <w:color w:val="1E2630"/>
+          <w:sz w:val="21"/>
+        </w:rPr>
+        <w:t>验证证据包括 Docker Compose 展开成功、Grafana dashboard JSON 解析成功、promtool 检查主配置和 12 条规则成功、amtool 检查路由成功，并用 promtool 逐条解析 17 个动态 PromQL。</w:t>
+      </w:r>
+    </w:p>
+    <w:p>
+      <w:pPr>
+        <w:pStyle w:val="Heading2"/>
+      </w:pPr>
+      <w:r>
+        <w:t>7.19 可观测性第五阶段：可复现实验与验收报告</w:t>
+      </w:r>
+    </w:p>
+    <w:p>
+      <w:pPr>
+        <w:spacing w:before="0" w:after="120" w:line="300" w:lineRule="auto"/>
+      </w:pPr>
+      <w:r>
+        <w:rPr>
+          <w:rFonts w:ascii="Microsoft YaHei" w:hAnsi="Microsoft YaHei" w:eastAsia="Microsoft YaHei"/>
+          <w:color w:val="1E2630"/>
+          <w:sz w:val="21"/>
+        </w:rPr>
+        <w:t>最后一阶段把‘手工暂停进程后肉眼看起来追上了’升级为可复现、可比较的实验。tcp_fault_proxy.py 在本地 9000 端口代理到云 server，可按固定随机种子注入双向延迟、抖动、短时阻塞和计划断连。它不随机删除 TCP 字节，因为那会破坏应用协议，不等价于网络层丢包；真实丢包只允许在隔离环境用 tc netem。</w:t>
+      </w:r>
+    </w:p>
+    <w:p>
+      <w:pPr>
+        <w:pStyle w:val="ListBullet"/>
+      </w:pPr>
+      <w:r>
+        <w:rPr>
+          <w:rFonts w:ascii="Microsoft YaHei" w:hAnsi="Microsoft YaHei" w:eastAsia="Microsoft YaHei"/>
+          <w:color w:val="1E2630"/>
+          <w:sz w:val="21"/>
+        </w:rPr>
+        <w:t>代理输出结构化 JSONL，记录参数、连接、方向字节数、错误和关闭原因。30 ms 单向延迟的回环集成测试测得至少 50 ms 往返，同时验证载荷未损坏。</w:t>
+      </w:r>
+    </w:p>
+    <w:p>
+      <w:pPr>
+        <w:pStyle w:val="ListBullet"/>
+      </w:pPr>
+      <w:r>
+        <w:rPr>
+          <w:rFonts w:ascii="Microsoft YaHei" w:hAnsi="Microsoft YaHei" w:eastAsia="Microsoft YaHei"/>
+          <w:color w:val="1E2630"/>
+          <w:sz w:val="21"/>
+        </w:rPr>
+        <w:t>prometheus_experiment_report.py 在指定窗口查询 17 个 PromQL，自动计算可用率、JOIN 成功率、首帧 P95、同步良好率、pair skew P95、控制 ACK P95、校正派发失败率、结果失败率和收敛 P95。</w:t>
+      </w:r>
+    </w:p>
+    <w:p>
+      <w:pPr>
+        <w:pStyle w:val="ListBullet"/>
+      </w:pPr>
+      <w:r>
+        <w:rPr>
+          <w:rFonts w:ascii="Microsoft YaHei" w:hAnsi="Microsoft YaHei" w:eastAsia="Microsoft YaHei"/>
+          <w:color w:val="1E2630"/>
+          <w:sz w:val="21"/>
+        </w:rPr>
+        <w:t>报告同时输出 Markdown 和 JSON，并把结论分成 PASS、FAIL、INSUFFICIENT_DATA 和 NO_DATA。样本不足不算通过，采集缺失也不算通过；--fail-on-objective 可供后续 CI 或验收门禁使用。</w:t>
+      </w:r>
+    </w:p>
+    <w:p>
+      <w:pPr>
+        <w:spacing w:before="0" w:after="120" w:line="300" w:lineRule="auto"/>
+      </w:pPr>
+      <w:r>
+        <w:rPr>
+          <w:rFonts w:ascii="Microsoft YaHei" w:hAnsi="Microsoft YaHei" w:eastAsia="Microsoft YaHei"/>
+          <w:color w:val="1E2630"/>
+          <w:sz w:val="21"/>
+        </w:rPr>
+        <w:t>八个 Python 测试覆盖达标、阈值违规、样本不足、无数据、采集端快速失败、Markdown 汇总、代理真实转发和空闲连接定时断开。至此形成事件定位、在线聚合、看板展示、持续告警、故障注入、报告验收的第一版闭环。仍未完成的产品指标包括每观影小时硬校正次数、客户端无崩溃会话率和 Nginx HTTP 指标，文档中保留这些边界。</w:t>
+      </w:r>
+    </w:p>
+    <w:p>
+      <w:pPr>
         <w:pStyle w:val="Heading1"/>
       </w:pPr>
       <w:r>
@@ -7462,7 +8298,20 @@
           <w:color w:val="1E2630"/>
           <w:sz w:val="21"/>
         </w:rPr>
-        <w:t>第九段可以这样说明产品指标：我把观测分成用户体验、同步正确性和系统健康三层。用户体验看 JOIN 成功率、首帧和无崩溃会话；同步正确性看有效 pair skew 的 P50/P95/P99、同步良好时间占比、校正成功率和收敛时间；技术侧按 latency、traffic、errors、saturation 四个黄金信号组织。实现时先定义分子分母、settling 排除条件和 SLO，再用 session_id 关联 JSONL 事件，避免只有零散日志却无法形成趋势。跨设备耗时不直接比较墙上时间，而由 server steady_clock 测量命令到 ACK 的闭环。</w:t>
+        <w:t>第九段可以这样说明产品指标：我把观测分成用户体验、同步正确性和系统健康三层。用户体验看 JOIN 成功率和首帧；同步正确性看有效 pair skew P95、同步良好时间占比、控制 ACK、校正成功率和收敛时间；技术侧按 RED 与 USE 组织。实现时先定义分子分母、settling 排除条件和 SLO，再用 session_id 关联 JSONL 事件。跨设备耗时不比较墙上时间，而由 server steady_clock 测量命令到 ACK 的闭环。</w:t>
+      </w:r>
+    </w:p>
+    <w:p>
+      <w:pPr>
+        <w:spacing w:before="0" w:after="120" w:line="300" w:lineRule="auto"/>
+      </w:pPr>
+      <w:r>
+        <w:rPr>
+          <w:rFonts w:ascii="Microsoft YaHei" w:hAnsi="Microsoft YaHei" w:eastAsia="Microsoft YaHei"/>
+          <w:color w:val="1E2630"/>
+          <w:sz w:val="21"/>
+        </w:rPr>
+        <w:t>第十段可以这样说明数据闭环：这些指标不是停在日志里。server 用固定桶和低基数 label 暴露 Prometheus，Grafana 自动展示连接、首帧、同步、控制、校正和主机资源；告警同时设置阈值、持续时间与最小样本量。为了让结论可重复，我又做了 TCP 故障代理注入延迟、抖动、阻塞和断连，并让报告器自动输出 PASS、FAIL、样本不足或无数据。这样一次优化必须经过故障复现、指标变化、恢复效果和验收报告，而不是只凭肉眼觉得变快。</w:t>
       </w:r>
     </w:p>
     <w:p>
@@ -7969,6 +8818,97 @@
     </w:p>
     <w:p>
       <w:pPr>
+        <w:pStyle w:val="ListNumber"/>
+      </w:pPr>
+      <w:r>
+        <w:rPr>
+          <w:rFonts w:ascii="Microsoft YaHei" w:hAnsi="Microsoft YaHei" w:eastAsia="Microsoft YaHei"/>
+          <w:color w:val="1E2630"/>
+          <w:sz w:val="21"/>
+        </w:rPr>
+        <w:t>ExperienceMetricsCollector：如何跟踪首帧、待确认控制、有效 pair 样本和校正收敛生命周期。</w:t>
+      </w:r>
+    </w:p>
+    <w:p>
+      <w:pPr>
+        <w:pStyle w:val="ListNumber"/>
+      </w:pPr>
+      <w:r>
+        <w:rPr>
+          <w:rFonts w:ascii="Microsoft YaHei" w:hAnsi="Microsoft YaHei" w:eastAsia="Microsoft YaHei"/>
+          <w:color w:val="1E2630"/>
+          <w:sz w:val="21"/>
+        </w:rPr>
+        <w:t>PrometheusMetrics：为什么 counter、gauge、histogram 各有不同语义，以及固定桶如何限制内存。</w:t>
+      </w:r>
+    </w:p>
+    <w:p>
+      <w:pPr>
+        <w:pStyle w:val="ListNumber"/>
+      </w:pPr>
+      <w:r>
+        <w:rPr>
+          <w:rFonts w:ascii="Microsoft YaHei" w:hAnsi="Microsoft YaHei" w:eastAsia="Microsoft YaHei"/>
+          <w:color w:val="1E2630"/>
+          <w:sz w:val="21"/>
+        </w:rPr>
+        <w:t>MetricsHttpServer：为什么监控端口只绑定 loopback，失败又不能拖垮 9000 业务监听。</w:t>
+      </w:r>
+    </w:p>
+    <w:p>
+      <w:pPr>
+        <w:pStyle w:val="ListNumber"/>
+      </w:pPr>
+      <w:r>
+        <w:rPr>
+          <w:rFonts w:ascii="Microsoft YaHei" w:hAnsi="Microsoft YaHei" w:eastAsia="Microsoft YaHei"/>
+          <w:color w:val="1E2630"/>
+          <w:sz w:val="21"/>
+        </w:rPr>
+        <w:t>Grafana 与 PromQL：如何从 counter 构造窗口成功率，从 histogram bucket 计算 P95。</w:t>
+      </w:r>
+    </w:p>
+    <w:p>
+      <w:pPr>
+        <w:pStyle w:val="ListNumber"/>
+      </w:pPr>
+      <w:r>
+        <w:rPr>
+          <w:rFonts w:ascii="Microsoft YaHei" w:hAnsi="Microsoft YaHei" w:eastAsia="Microsoft YaHei"/>
+          <w:color w:val="1E2630"/>
+          <w:sz w:val="21"/>
+        </w:rPr>
+        <w:t>告警抗噪：为什么阈值之外还必须同时要求最小样本量和持续时间。</w:t>
+      </w:r>
+    </w:p>
+    <w:p>
+      <w:pPr>
+        <w:pStyle w:val="ListNumber"/>
+      </w:pPr>
+      <w:r>
+        <w:rPr>
+          <w:rFonts w:ascii="Microsoft YaHei" w:hAnsi="Microsoft YaHei" w:eastAsia="Microsoft YaHei"/>
+          <w:color w:val="1E2630"/>
+          <w:sz w:val="21"/>
+        </w:rPr>
+        <w:t>故障实验：TCP 应用层延迟代理能验证什么，为什么不能用丢字节冒充 IP 丢包。</w:t>
+      </w:r>
+    </w:p>
+    <w:p>
+      <w:pPr>
+        <w:pStyle w:val="ListNumber"/>
+      </w:pPr>
+      <w:r>
+        <w:rPr>
+          <w:rFonts w:ascii="Microsoft YaHei" w:hAnsi="Microsoft YaHei" w:eastAsia="Microsoft YaHei"/>
+          <w:color w:val="1E2630"/>
+          <w:sz w:val="21"/>
+        </w:rPr>
+        <w:t>验收报告：为什么 PASS、FAIL、INSUFFICIENT_DATA、NO_DATA 必须是四种不同结论。</w:t>
+      </w:r>
+    </w:p>
+    <w:p>
+      <w:pPr>
         <w:pStyle w:val="Heading1"/>
       </w:pPr>
       <w:r>
@@ -7978,79 +8918,99 @@
     <w:p>
       <w:pPr>
         <w:pStyle w:val="ListNumber"/>
+        <w:spacing w:before="0" w:after="40" w:line="252" w:lineRule="auto"/>
       </w:pPr>
       <w:r>
         <w:rPr>
           <w:rFonts w:ascii="Microsoft YaHei" w:hAnsi="Microsoft YaHei" w:eastAsia="Microsoft YaHei"/>
           <w:color w:val="1E2630"/>
-          <w:sz w:val="21"/>
-        </w:rPr>
-        <w:t>实现首帧、初始同步、控制应用 ACK、校正收敛和会话汇总事件，形成八项核心体验指标。</w:t>
+          <w:sz w:val="18"/>
+        </w:rPr>
+        <w:t>把本分支部署到云服务器，用两台真实电脑完成 baseline、延迟抖动、短时阻塞、断连和 server 重启实验，并保存自动报告。</w:t>
       </w:r>
     </w:p>
     <w:p>
       <w:pPr>
         <w:pStyle w:val="ListNumber"/>
+        <w:spacing w:before="0" w:after="40" w:line="252" w:lineRule="auto"/>
       </w:pPr>
       <w:r>
         <w:rPr>
           <w:rFonts w:ascii="Microsoft YaHei" w:hAnsi="Microsoft YaHei" w:eastAsia="Microsoft YaHei"/>
           <w:color w:val="1E2630"/>
-          <w:sz w:val="21"/>
-        </w:rPr>
-        <w:t>为 JSONL 增加日志轮转与保留策略，并从事件生成离线会话报告，先验证成功率和分位数口径。</w:t>
+          <w:sz w:val="18"/>
+        </w:rPr>
+        <w:t>根据真实报告调整首帧、同步和校正 SLO；只有样本量充足时才修改阈值，避免为通过测试而降低标准。</w:t>
       </w:r>
     </w:p>
     <w:p>
       <w:pPr>
         <w:pStyle w:val="ListNumber"/>
+        <w:spacing w:before="0" w:after="40" w:line="252" w:lineRule="auto"/>
       </w:pPr>
       <w:r>
         <w:rPr>
           <w:rFonts w:ascii="Microsoft YaHei" w:hAnsi="Microsoft YaHei" w:eastAsia="Microsoft YaHei"/>
           <w:color w:val="1E2630"/>
-          <w:sz w:val="21"/>
-        </w:rPr>
-        <w:t>接入 Prometheus counter/gauge/histogram 与 /metrics endpoint，严格限制 label 基数。</w:t>
+          <w:sz w:val="18"/>
+        </w:rPr>
+        <w:t>增加有效 Playing 时长累计，补齐 hard_corrections_per_watch_hour。</w:t>
       </w:r>
     </w:p>
     <w:p>
       <w:pPr>
         <w:pStyle w:val="ListNumber"/>
+        <w:spacing w:before="0" w:after="40" w:line="252" w:lineRule="auto"/>
       </w:pPr>
       <w:r>
         <w:rPr>
           <w:rFonts w:ascii="Microsoft YaHei" w:hAnsi="Microsoft YaHei" w:eastAsia="Microsoft YaHei"/>
           <w:color w:val="1E2630"/>
-          <w:sz w:val="21"/>
-        </w:rPr>
-        <w:t>建立用户体验、同步质量、系统资源三张 Grafana 看板，并为持续超标而非单点异常配置告警。</w:t>
+          <w:sz w:val="18"/>
+        </w:rPr>
+        <w:t>增加客户端崩溃上报或监督进程，补齐 crash_free_session_ratio，并明确区分崩溃、主动退出和断网。</w:t>
       </w:r>
     </w:p>
     <w:p>
       <w:pPr>
         <w:pStyle w:val="ListNumber"/>
+        <w:spacing w:before="0" w:after="40" w:line="252" w:lineRule="auto"/>
       </w:pPr>
       <w:r>
         <w:rPr>
           <w:rFonts w:ascii="Microsoft YaHei" w:hAnsi="Microsoft YaHei" w:eastAsia="Microsoft YaHei"/>
           <w:color w:val="1E2630"/>
-          <w:sz w:val="21"/>
-        </w:rPr>
-        <w:t>用两台真实电脑和延迟、抖动、丢包、进程暂停、断网、server 重启实验验证 SLO。</w:t>
+          <w:sz w:val="18"/>
+        </w:rPr>
+        <w:t>接入 Nginx 请求延迟、4xx/5xx、Range 请求和出口带宽；配置私有 Alertmanager 通知渠道。</w:t>
       </w:r>
     </w:p>
     <w:p>
       <w:pPr>
         <w:pStyle w:val="ListNumber"/>
+        <w:spacing w:before="0" w:after="40" w:line="252" w:lineRule="auto"/>
       </w:pPr>
       <w:r>
         <w:rPr>
           <w:rFonts w:ascii="Microsoft YaHei" w:hAnsi="Microsoft YaHei" w:eastAsia="Microsoft YaHei"/>
           <w:color w:val="1E2630"/>
-          <w:sz w:val="21"/>
-        </w:rPr>
-        <w:t>补齐服务托管、健康检查、优雅停机、自动重连、CI 和发布包；随后增加聊天与弹幕。</w:t>
+          <w:sz w:val="18"/>
+        </w:rPr>
+        <w:t>为 JSONL 增加 logrotate 与保留策略，为 Prometheus/Grafana 数据卷制定备份和容量上限。</w:t>
+      </w:r>
+    </w:p>
+    <w:p>
+      <w:pPr>
+        <w:pStyle w:val="ListNumber"/>
+        <w:spacing w:before="0" w:after="40" w:line="252" w:lineRule="auto"/>
+      </w:pPr>
+      <w:r>
+        <w:rPr>
+          <w:rFonts w:ascii="Microsoft YaHei" w:hAnsi="Microsoft YaHei" w:eastAsia="Microsoft YaHei"/>
+          <w:color w:val="1E2630"/>
+          <w:sz w:val="18"/>
+        </w:rPr>
+        <w:t>补齐 systemd 服务托管、优雅停机、自动重连、CI 和 Windows 发布包；随后再增加聊天与弹幕。</w:t>
       </w:r>
     </w:p>
     <w:sectPr>

</xml_diff>